<commit_message>
Add subheadings for chapters 3-5 in Table of Contents
TOC now shows all subsections consistently across all chapters:
- Ch3: 3.1-3.8 (Sample, IRR, DISCERN, JAMA, Creator, Engagement, Q-Level, Format)
- Ch4: 4.1-4.6 (Summary, Literature, Implications, Strengths, Limitations, Future)
- Ch5: 5.1-5.3 (Conclusions, Practical Recs, Future Research)

Co-Authored-By: Claude Opus 4.6 <noreply@anthropic.com>
</commit_message>
<xml_diff>
--- a/final/thesis_complete.docx
+++ b/final/thesis_complete.docx
@@ -440,7 +440,7 @@
           <w:rFonts w:ascii="Times New Roman" w:hAnsi="Times New Roman"/>
           <w:sz w:val="24"/>
         </w:rPr>
-        <w:t>4. DISCUSSION</w:t>
+        <w:t xml:space="preserve">    3.1 Sample Characteristics</w:t>
       </w:r>
     </w:p>
     <w:p>
@@ -453,7 +453,228 @@
           <w:rFonts w:ascii="Times New Roman" w:hAnsi="Times New Roman"/>
           <w:sz w:val="24"/>
         </w:rPr>
+        <w:t xml:space="preserve">    3.2 Inter-Rater Reliability</w:t>
+      </w:r>
+    </w:p>
+    <w:p>
+      <w:pPr>
+        <w:spacing w:line="360" w:lineRule="auto"/>
+        <w:jc w:val="left"/>
+      </w:pPr>
+      <w:r>
+        <w:rPr>
+          <w:rFonts w:ascii="Times New Roman" w:hAnsi="Times New Roman"/>
+          <w:sz w:val="24"/>
+        </w:rPr>
+        <w:t xml:space="preserve">    3.3 DISCERN Scores by Platform</w:t>
+      </w:r>
+    </w:p>
+    <w:p>
+      <w:pPr>
+        <w:spacing w:line="360" w:lineRule="auto"/>
+        <w:jc w:val="left"/>
+      </w:pPr>
+      <w:r>
+        <w:rPr>
+          <w:rFonts w:ascii="Times New Roman" w:hAnsi="Times New Roman"/>
+          <w:sz w:val="24"/>
+        </w:rPr>
+        <w:t xml:space="preserve">    3.4 JAMA Benchmark Compliance by Platform</w:t>
+      </w:r>
+    </w:p>
+    <w:p>
+      <w:pPr>
+        <w:spacing w:line="360" w:lineRule="auto"/>
+        <w:jc w:val="left"/>
+      </w:pPr>
+      <w:r>
+        <w:rPr>
+          <w:rFonts w:ascii="Times New Roman" w:hAnsi="Times New Roman"/>
+          <w:sz w:val="24"/>
+        </w:rPr>
+        <w:t xml:space="preserve">    3.5 Creator Type Analysis</w:t>
+      </w:r>
+    </w:p>
+    <w:p>
+      <w:pPr>
+        <w:spacing w:line="360" w:lineRule="auto"/>
+        <w:jc w:val="left"/>
+      </w:pPr>
+      <w:r>
+        <w:rPr>
+          <w:rFonts w:ascii="Times New Roman" w:hAnsi="Times New Roman"/>
+          <w:sz w:val="24"/>
+        </w:rPr>
+        <w:t xml:space="preserve">    3.6 Engagement-Quality Relationship</w:t>
+      </w:r>
+    </w:p>
+    <w:p>
+      <w:pPr>
+        <w:spacing w:line="360" w:lineRule="auto"/>
+        <w:jc w:val="left"/>
+      </w:pPr>
+      <w:r>
+        <w:rPr>
+          <w:rFonts w:ascii="Times New Roman" w:hAnsi="Times New Roman"/>
+          <w:sz w:val="24"/>
+        </w:rPr>
+        <w:t xml:space="preserve">    3.7 DISCERN Question-Level Patterns</w:t>
+      </w:r>
+    </w:p>
+    <w:p>
+      <w:pPr>
+        <w:spacing w:line="360" w:lineRule="auto"/>
+        <w:jc w:val="left"/>
+      </w:pPr>
+      <w:r>
+        <w:rPr>
+          <w:rFonts w:ascii="Times New Roman" w:hAnsi="Times New Roman"/>
+          <w:sz w:val="24"/>
+        </w:rPr>
+        <w:t xml:space="preserve">    3.8 Content Format and Search Term Effects</w:t>
+      </w:r>
+    </w:p>
+    <w:p>
+      <w:pPr>
+        <w:spacing w:line="360" w:lineRule="auto"/>
+        <w:jc w:val="left"/>
+      </w:pPr>
+      <w:r>
+        <w:rPr>
+          <w:rFonts w:ascii="Times New Roman" w:hAnsi="Times New Roman"/>
+          <w:sz w:val="24"/>
+        </w:rPr>
+        <w:t>4. DISCUSSION</w:t>
+      </w:r>
+    </w:p>
+    <w:p>
+      <w:pPr>
+        <w:spacing w:line="360" w:lineRule="auto"/>
+        <w:jc w:val="left"/>
+      </w:pPr>
+      <w:r>
+        <w:rPr>
+          <w:rFonts w:ascii="Times New Roman" w:hAnsi="Times New Roman"/>
+          <w:sz w:val="24"/>
+        </w:rPr>
+        <w:t xml:space="preserve">    4.1 Summary of Key Findings</w:t>
+      </w:r>
+    </w:p>
+    <w:p>
+      <w:pPr>
+        <w:spacing w:line="360" w:lineRule="auto"/>
+        <w:jc w:val="left"/>
+      </w:pPr>
+      <w:r>
+        <w:rPr>
+          <w:rFonts w:ascii="Times New Roman" w:hAnsi="Times New Roman"/>
+          <w:sz w:val="24"/>
+        </w:rPr>
+        <w:t xml:space="preserve">    4.2 Comparison with Existing Literature</w:t>
+      </w:r>
+    </w:p>
+    <w:p>
+      <w:pPr>
+        <w:spacing w:line="360" w:lineRule="auto"/>
+        <w:jc w:val="left"/>
+      </w:pPr>
+      <w:r>
+        <w:rPr>
+          <w:rFonts w:ascii="Times New Roman" w:hAnsi="Times New Roman"/>
+          <w:sz w:val="24"/>
+        </w:rPr>
+        <w:t xml:space="preserve">    4.3 Implications for Public Health Practice</w:t>
+      </w:r>
+    </w:p>
+    <w:p>
+      <w:pPr>
+        <w:spacing w:line="360" w:lineRule="auto"/>
+        <w:jc w:val="left"/>
+      </w:pPr>
+      <w:r>
+        <w:rPr>
+          <w:rFonts w:ascii="Times New Roman" w:hAnsi="Times New Roman"/>
+          <w:sz w:val="24"/>
+        </w:rPr>
+        <w:t xml:space="preserve">    4.4 Strengths of the Study</w:t>
+      </w:r>
+    </w:p>
+    <w:p>
+      <w:pPr>
+        <w:spacing w:line="360" w:lineRule="auto"/>
+        <w:jc w:val="left"/>
+      </w:pPr>
+      <w:r>
+        <w:rPr>
+          <w:rFonts w:ascii="Times New Roman" w:hAnsi="Times New Roman"/>
+          <w:sz w:val="24"/>
+        </w:rPr>
+        <w:t xml:space="preserve">    4.5 Limitations</w:t>
+      </w:r>
+    </w:p>
+    <w:p>
+      <w:pPr>
+        <w:spacing w:line="360" w:lineRule="auto"/>
+        <w:jc w:val="left"/>
+      </w:pPr>
+      <w:r>
+        <w:rPr>
+          <w:rFonts w:ascii="Times New Roman" w:hAnsi="Times New Roman"/>
+          <w:sz w:val="24"/>
+        </w:rPr>
+        <w:t xml:space="preserve">    4.6 Recommendations for Future Research</w:t>
+      </w:r>
+    </w:p>
+    <w:p>
+      <w:pPr>
+        <w:spacing w:line="360" w:lineRule="auto"/>
+        <w:jc w:val="left"/>
+      </w:pPr>
+      <w:r>
+        <w:rPr>
+          <w:rFonts w:ascii="Times New Roman" w:hAnsi="Times New Roman"/>
+          <w:sz w:val="24"/>
+        </w:rPr>
         <w:t>5. CONCLUSIONS AND RECOMMENDATIONS</w:t>
+      </w:r>
+    </w:p>
+    <w:p>
+      <w:pPr>
+        <w:spacing w:line="360" w:lineRule="auto"/>
+        <w:jc w:val="left"/>
+      </w:pPr>
+      <w:r>
+        <w:rPr>
+          <w:rFonts w:ascii="Times New Roman" w:hAnsi="Times New Roman"/>
+          <w:sz w:val="24"/>
+        </w:rPr>
+        <w:t xml:space="preserve">    5.1 Summary of Conclusions</w:t>
+      </w:r>
+    </w:p>
+    <w:p>
+      <w:pPr>
+        <w:spacing w:line="360" w:lineRule="auto"/>
+        <w:jc w:val="left"/>
+      </w:pPr>
+      <w:r>
+        <w:rPr>
+          <w:rFonts w:ascii="Times New Roman" w:hAnsi="Times New Roman"/>
+          <w:sz w:val="24"/>
+        </w:rPr>
+        <w:t xml:space="preserve">    5.2 Practical Recommendations</w:t>
+      </w:r>
+    </w:p>
+    <w:p>
+      <w:pPr>
+        <w:spacing w:line="360" w:lineRule="auto"/>
+        <w:jc w:val="left"/>
+      </w:pPr>
+      <w:r>
+        <w:rPr>
+          <w:rFonts w:ascii="Times New Roman" w:hAnsi="Times New Roman"/>
+          <w:sz w:val="24"/>
+        </w:rPr>
+        <w:t xml:space="preserve">    5.3 Recommendations for Future Research</w:t>
       </w:r>
     </w:p>
     <w:p>

</xml_diff>

<commit_message>
clarify appendix d audited sample and clean reference notes
</commit_message>
<xml_diff>
--- a/final/thesis_complete.docx
+++ b/final/thesis_complete.docx
@@ -17599,10 +17599,7 @@
     </w:p>
     <w:p>
       <w:r>
-        <w:t>All data, scripts, and analysis outputs are maintained in a version-controlled Git repository available at https://github.com/ayothedoc3/masters-thesis (accessed 25 March 2026). The repository snapshot current at the time of submission contains the materials supporting the submitted thesis. The complete analysis can be reproduced by running: python analysis/run_analysis.py from the project root directory. The final audited input files are data/csv/master_dataset_corrected.csv and data/csv/second_rater_score</w:t>
-      </w:r>
-      <w:r>
-        <w:t>s.csv. The script normalises common content-format label variants before analysis and writes all output files (figures, tables, and analysis_report.txt) to analysis/output/.</w:t>
+        <w:t>All data, scripts, and analysis outputs are maintained in a version-controlled Git repository available at https://github.com/ayothedoc3/masters-thesis (accessed 26 March 2026). The repository snapshot current at the time of submission contains the materials supporting the submitted thesis. The complete analysis can be reproduced by running: python analysis/run_analysis.py from the project root directory. The final audited input files are data/csv/master_dataset_corrected.csv and data/csv/second_rater_scores.csv. The final audited analytical sample contains 197 items: 50 websites, 50 YouTube videos, 47 TikTok videos, and 50 Instagram posts. The script normalises common content-format label variants before analysis and writes all output files (figures, tables, and analysis_report.txt) to analysis/output/.</w:t>
       </w:r>
     </w:p>
     <w:p>

</xml_diff>

<commit_message>
move toc before abstracts for lsu compliance
</commit_message>
<xml_diff>
--- a/final/thesis_complete.docx
+++ b/final/thesis_complete.docx
@@ -358,189 +358,6 @@
     </w:p>
     <w:p>
       <w:pPr>
-        <w:spacing w:after="240"/>
-        <w:jc w:val="center"/>
-      </w:pPr>
-      <w:r>
-        <w:rPr>
-          <w:b/>
-          <w:sz w:val="28"/>
-        </w:rPr>
-        <w:lastRenderedPageBreak/>
-        <w:t>ABSTRACT</w:t>
-      </w:r>
-    </w:p>
-    <w:p>
-      <w:pPr>
-        <w:jc w:val="center"/>
-      </w:pPr>
-      <w:r>
-        <w:rPr>
-          <w:b/>
-        </w:rPr>
-        <w:t>QUALITY OF PHYSICAL ACTIVITY INFORMATION ON TRADITIONAL WEBSITES VERSUS SOCIAL MEDIA PLATFORMS: A CROSS-SECTIONAL CONTENT ANALYSIS USING DISCERN AND JAMA BENCHMARKS</w:t>
-      </w:r>
-    </w:p>
-    <w:p>
-      <w:pPr>
-        <w:jc w:val="center"/>
-      </w:pPr>
-      <w:r>
-        <w:rPr>
-          <w:i/>
-        </w:rPr>
-        <w:t>FIZINIO AKTYVUMO INFORMACIJOS KOKYBĖ TRADICINĖSE INTERNETO SVETAINĖSE IR SOCIALINIŲ TINKLŲ PLATFORMOSE: SKERSPJŪVIO TURINIO ANALIZĖ TAIKANT DISCERN IR JAMA KRITERIJUS</w:t>
-      </w:r>
-    </w:p>
-    <w:p>
-      <w:pPr>
-        <w:spacing w:after="240"/>
-        <w:jc w:val="left"/>
-      </w:pPr>
-      <w:r>
-        <w:rPr>
-          <w:i/>
-        </w:rPr>
-        <w:t>Keywords: physical activity; health information quality; social media; DISCERN; JAMA benchmarks</w:t>
-      </w:r>
-    </w:p>
-    <w:p>
-      <w:pPr>
-        <w:ind w:firstLine="709"/>
-      </w:pPr>
-      <w:r>
-        <w:t xml:space="preserve">Problem. The public increasingly relies on websites and social media for physical activity advice, yet evidence comparing the quality of information across these environments remains limited. Aim. To compare the quality of physical activity information on traditional websites, YouTube, TikTok, and Instagram using DISCERN and JAMA benchmarks. Objectives. To examine platform differences, creator-type differences, and associations between engagement metrics and quality. Hypothesis. Website content and content </w:t>
-      </w:r>
-      <w:r>
-        <w:t>produced by healthcare or certified fitness professionals would score higher than short-form social media content, whereas engagement metrics would not reliably indicate quality. Methods. A cross-sectional content analysis was conducted on 197 publicly accessible English-language items retrieved with five standardized search terms. Information quality was assessed with the 16-item DISCERN instrument and four JAMA criteria. Inter-rater reliability was evaluated on 40 items. Kruskal-Wallis, Mann-Whitney U, ch</w:t>
-      </w:r>
-      <w:r>
-        <w:t>i-square, and Spearman analyses were used. Main findings. Quality differed significantly by platform: websites ranked highest, followed by YouTube, TikTok, and Instagram. JAMA compliance was low across all platforms. Creator type was associated with DISCERN scores, with healthcare and certified fitness professionals performing better than general users. On YouTube, higher views and likes were associated with lower quality. Conclusions. Traditional websites remain the most reliable source of physical activit</w:t>
-      </w:r>
-      <w:r>
-        <w:t>y information, whereas short-form social media content is more vulnerable to low quality and weak transparency.</w:t>
-      </w:r>
-    </w:p>
-    <w:p>
-      <w:r>
-        <w:br w:type="page"/>
-      </w:r>
-    </w:p>
-    <w:p>
-      <w:pPr>
-        <w:spacing w:after="240"/>
-        <w:jc w:val="center"/>
-      </w:pPr>
-      <w:r>
-        <w:rPr>
-          <w:b/>
-          <w:sz w:val="28"/>
-        </w:rPr>
-        <w:lastRenderedPageBreak/>
-        <w:t>SANTRAUKA</w:t>
-      </w:r>
-    </w:p>
-    <w:p>
-      <w:pPr>
-        <w:jc w:val="center"/>
-      </w:pPr>
-      <w:r>
-        <w:rPr>
-          <w:b/>
-        </w:rPr>
-        <w:t>FIZINIO AKTYVUMO INFORMACIJOS KOKYBĖ TRADICINĖSE INTERNETO SVETAINĖSE IR SOCIALINIŲ TINKLŲ PLATFORMOSE: SKERSPJŪVIO TURINIO ANALIZĖ TAIKANT DISCERN IR JAMA KRITERIJUS</w:t>
-      </w:r>
-    </w:p>
-    <w:p>
-      <w:pPr>
-        <w:jc w:val="center"/>
-      </w:pPr>
-      <w:r>
-        <w:rPr>
-          <w:i/>
-        </w:rPr>
-        <w:t>QUALITY OF PHYSICAL ACTIVITY INFORMATION ON TRADITIONAL WEBSITES VERSUS SOCIAL MEDIA PLATFORMS: A CROSS-SECTIONAL CONTENT ANALYSIS USING DISCERN AND JAMA BENCHMARKS</w:t>
-      </w:r>
-    </w:p>
-    <w:p>
-      <w:pPr>
-        <w:spacing w:after="240"/>
-        <w:jc w:val="left"/>
-      </w:pPr>
-      <w:r>
-        <w:rPr>
-          <w:i/>
-        </w:rPr>
-        <w:t>Raktiniai žodžiai: fizinis aktyvumas; sveikatos informacijos kokybė; socialiniai tinklai; DISCERN; JAMA kriterijai</w:t>
-      </w:r>
-    </w:p>
-    <w:p>
-      <w:pPr>
-        <w:ind w:firstLine="709"/>
-      </w:pPr>
-      <w:r>
-        <w:t>Problema. Visuomenė vis dažniau fizinio aktyvumo informacijos ieško interneto svetainėse ir socialiniuose tinkluose, tačiau lyginamųjų duomenų apie informacijos kokybę skirtingose skaitmeninėse aplinkose vis dar trūksta. Tikslas. Palyginti fizinio aktyvumo informacijos kokybę tradicinėse interneto svetainėse, YouTube, TikTok ir Instagram, taikant DISCERN instrumentą ir JAMA kriterijus. Uždaviniai. Įvertinti platformų skirtumus, kūrėjų tipų skirtumus ir ryšį tarp įsitraukimo rodiklių bei informacijos kokybės</w:t>
-      </w:r>
-      <w:r>
-        <w:t>. Hipotezė. Manyta, kad tradicinių interneto svetainių turinys ir sveikatos priežiūros ar sertifikuotų fitneso specialistų sukurtas turinys bus aukštesnės kokybės nei trumpo formato socialinių tinklų turinys, o įsitraukimo rodikliai patikimai neatspindės kokybės. Metodai. Atlikta 197 viešai prieinamų anglų kalba paskelbtų vienetų skerspjūvio turinio analizė, naudojant penkias standartizuotas paieškos frazes. Informacijos kokybė vertinta 16 klausimų DISCERN instrumentu ir keturiais JAMA kriterijais. Tarpvert</w:t>
-      </w:r>
-      <w:r>
-        <w:t>intojų patikimumas vertintas 40 vienetų imtyje. Taikyti Kruskal-Wallis, Mann-Whitney U, chi kvadrato ir Spearman koreliacijos testai. Pagrindiniai rezultatai. Informacijos kokybė statistiškai reikšmingai skyrėsi tarp platformų: aukščiausius rodiklius pasiekė interneto svetainės, po jų sekė YouTube, TikTok ir Instagram. JAMA kriterijų atitikimas visose platformose buvo žemas. Kūrėjo tipas buvo susijęs su DISCERN įverčiais: geriau pasirodė sveikatos priežiūros ir sertifikuoti fizinio aktyvumo specialistai nei</w:t>
-      </w:r>
-      <w:r>
-        <w:t xml:space="preserve"> bendrieji naudotojai. YouTube platformoje didesnis peržiūrų ir patiktukų skaičius buvo susijęs su prastesne kokybe. Išvados. Tradicinės interneto svetainės išlieka patikimiausiu fizinio aktyvumo informacijos šaltiniu, o trumpo formato socialinių tinklų turinys dažniau pasižymi prastesne kokybe ir mažesniu skaidrumu.</w:t>
-      </w:r>
-    </w:p>
-    <w:p>
-      <w:r>
-        <w:br w:type="page"/>
-      </w:r>
-    </w:p>
-    <w:p>
-      <w:pPr>
-        <w:spacing w:after="240"/>
-        <w:jc w:val="center"/>
-      </w:pPr>
-      <w:r>
-        <w:rPr>
-          <w:b/>
-          <w:sz w:val="28"/>
-        </w:rPr>
-        <w:lastRenderedPageBreak/>
-        <w:t>ACKNOWLEDGMENTS</w:t>
-      </w:r>
-    </w:p>
-    <w:p>
-      <w:pPr>
-        <w:ind w:firstLine="709"/>
-      </w:pPr>
-      <w:r>
-        <w:t>I would like to express my sincere gratitude to my supervisor, Dr. Antanas Usas, for his guidance, expertise, and constructive feedback throughout this research project.</w:t>
-      </w:r>
-    </w:p>
-    <w:p>
-      <w:pPr>
-        <w:ind w:firstLine="709"/>
-      </w:pPr>
-      <w:r>
-        <w:t>I am grateful to the faculty and staff of the Master of Public Health programme at Lithuanian Sports University for providing the academic environment and resources necessary to complete this thesis.</w:t>
-      </w:r>
-    </w:p>
-    <w:p>
-      <w:pPr>
-        <w:ind w:firstLine="709"/>
-      </w:pPr>
-      <w:r>
-        <w:t>I also thank my family and friends for their patience and support during the course of my studies.</w:t>
-      </w:r>
-    </w:p>
-    <w:p>
-      <w:r>
-        <w:br w:type="page"/>
-      </w:r>
-    </w:p>
-    <w:p>
-      <w:pPr>
         <w:jc w:val="center"/>
       </w:pPr>
       <w:r>
@@ -571,7 +388,7 @@
       <w:r>
         <w:fldChar w:fldCharType="separate"/>
       </w:r>
-      <w:hyperlink w:anchor="_Toc225879152" w:history="1">
+      <w:hyperlink w:anchor="_Toc225985149" w:history="1">
         <w:r>
           <w:rPr>
             <w:rStyle w:val="Hyperlink"/>
@@ -598,7 +415,75 @@
             <w:noProof/>
             <w:webHidden/>
           </w:rPr>
-          <w:instrText xml:space="preserve"> PAGEREF _Toc225879152 \h </w:instrText>
+          <w:instrText xml:space="preserve"> PAGEREF _Toc225985149 \h </w:instrText>
+        </w:r>
+        <w:r>
+          <w:rPr>
+            <w:noProof/>
+            <w:webHidden/>
+          </w:rPr>
+        </w:r>
+        <w:r>
+          <w:rPr>
+            <w:noProof/>
+            <w:webHidden/>
+          </w:rPr>
+          <w:fldChar w:fldCharType="separate"/>
+        </w:r>
+        <w:r>
+          <w:rPr>
+            <w:noProof/>
+            <w:webHidden/>
+          </w:rPr>
+          <w:t>10</w:t>
+        </w:r>
+        <w:r>
+          <w:rPr>
+            <w:noProof/>
+            <w:webHidden/>
+          </w:rPr>
+          <w:fldChar w:fldCharType="end"/>
+        </w:r>
+      </w:hyperlink>
+    </w:p>
+    <w:p>
+      <w:pPr>
+        <w:pStyle w:val="TOC1"/>
+        <w:tabs>
+          <w:tab w:val="right" w:leader="dot" w:pos="9016"/>
+        </w:tabs>
+        <w:rPr>
+          <w:noProof/>
+        </w:rPr>
+      </w:pPr>
+      <w:hyperlink w:anchor="_Toc225985150" w:history="1">
+        <w:r>
+          <w:rPr>
+            <w:rStyle w:val="Hyperlink"/>
+            <w:noProof/>
+          </w:rPr>
+          <w:t>CHAPTER 1. LITERATURE REVIEW</w:t>
+        </w:r>
+        <w:r>
+          <w:rPr>
+            <w:noProof/>
+            <w:webHidden/>
+          </w:rPr>
+          <w:tab/>
+        </w:r>
+        <w:r>
+          <w:rPr>
+            <w:noProof/>
+            <w:webHidden/>
+          </w:rPr>
+          <w:fldChar w:fldCharType="begin"/>
+        </w:r>
+        <w:r>
+          <w:rPr>
+            <w:noProof/>
+            <w:webHidden/>
+          </w:rPr>
+          <w:instrText xml:space="preserve"> PAGEREF _Toc225985150 \h </w:instrText>
         </w:r>
         <w:r>
           <w:rPr>
@@ -631,7 +516,7 @@
     </w:p>
     <w:p>
       <w:pPr>
-        <w:pStyle w:val="TOC1"/>
+        <w:pStyle w:val="TOC2"/>
         <w:tabs>
           <w:tab w:val="right" w:leader="dot" w:pos="9016"/>
         </w:tabs>
@@ -639,13 +524,13 @@
           <w:noProof/>
         </w:rPr>
       </w:pPr>
-      <w:hyperlink w:anchor="_Toc225879153" w:history="1">
+      <w:hyperlink w:anchor="_Toc225985151" w:history="1">
         <w:r>
           <w:rPr>
             <w:rStyle w:val="Hyperlink"/>
             <w:noProof/>
           </w:rPr>
-          <w:t>CHAPTER 1. LITERATURE REVIEW</w:t>
+          <w:t>1.1 Digital Transformation of Health Information Seeking</w:t>
         </w:r>
         <w:r>
           <w:rPr>
@@ -666,7 +551,75 @@
             <w:noProof/>
             <w:webHidden/>
           </w:rPr>
-          <w:instrText xml:space="preserve"> PAGEREF _Toc225879153 \h </w:instrText>
+          <w:instrText xml:space="preserve"> PAGEREF _Toc225985151 \h </w:instrText>
+        </w:r>
+        <w:r>
+          <w:rPr>
+            <w:noProof/>
+            <w:webHidden/>
+          </w:rPr>
+        </w:r>
+        <w:r>
+          <w:rPr>
+            <w:noProof/>
+            <w:webHidden/>
+          </w:rPr>
+          <w:fldChar w:fldCharType="separate"/>
+        </w:r>
+        <w:r>
+          <w:rPr>
+            <w:noProof/>
+            <w:webHidden/>
+          </w:rPr>
+          <w:t>11</w:t>
+        </w:r>
+        <w:r>
+          <w:rPr>
+            <w:noProof/>
+            <w:webHidden/>
+          </w:rPr>
+          <w:fldChar w:fldCharType="end"/>
+        </w:r>
+      </w:hyperlink>
+    </w:p>
+    <w:p>
+      <w:pPr>
+        <w:pStyle w:val="TOC2"/>
+        <w:tabs>
+          <w:tab w:val="right" w:leader="dot" w:pos="9016"/>
+        </w:tabs>
+        <w:rPr>
+          <w:noProof/>
+        </w:rPr>
+      </w:pPr>
+      <w:hyperlink w:anchor="_Toc225985152" w:history="1">
+        <w:r>
+          <w:rPr>
+            <w:rStyle w:val="Hyperlink"/>
+            <w:noProof/>
+          </w:rPr>
+          <w:t>1.2 Theoretical Frameworks</w:t>
+        </w:r>
+        <w:r>
+          <w:rPr>
+            <w:noProof/>
+            <w:webHidden/>
+          </w:rPr>
+          <w:tab/>
+        </w:r>
+        <w:r>
+          <w:rPr>
+            <w:noProof/>
+            <w:webHidden/>
+          </w:rPr>
+          <w:fldChar w:fldCharType="begin"/>
+        </w:r>
+        <w:r>
+          <w:rPr>
+            <w:noProof/>
+            <w:webHidden/>
+          </w:rPr>
+          <w:instrText xml:space="preserve"> PAGEREF _Toc225985152 \h </w:instrText>
         </w:r>
         <w:r>
           <w:rPr>
@@ -707,143 +660,7 @@
           <w:noProof/>
         </w:rPr>
       </w:pPr>
-      <w:hyperlink w:anchor="_Toc225879154" w:history="1">
-        <w:r>
-          <w:rPr>
-            <w:rStyle w:val="Hyperlink"/>
-            <w:noProof/>
-          </w:rPr>
-          <w:t>1.1 Digital Transformation of Health Information Seeking</w:t>
-        </w:r>
-        <w:r>
-          <w:rPr>
-            <w:noProof/>
-            <w:webHidden/>
-          </w:rPr>
-          <w:tab/>
-        </w:r>
-        <w:r>
-          <w:rPr>
-            <w:noProof/>
-            <w:webHidden/>
-          </w:rPr>
-          <w:fldChar w:fldCharType="begin"/>
-        </w:r>
-        <w:r>
-          <w:rPr>
-            <w:noProof/>
-            <w:webHidden/>
-          </w:rPr>
-          <w:instrText xml:space="preserve"> PAGEREF _Toc225879154 \h </w:instrText>
-        </w:r>
-        <w:r>
-          <w:rPr>
-            <w:noProof/>
-            <w:webHidden/>
-          </w:rPr>
-        </w:r>
-        <w:r>
-          <w:rPr>
-            <w:noProof/>
-            <w:webHidden/>
-          </w:rPr>
-          <w:fldChar w:fldCharType="separate"/>
-        </w:r>
-        <w:r>
-          <w:rPr>
-            <w:noProof/>
-            <w:webHidden/>
-          </w:rPr>
-          <w:t>12</w:t>
-        </w:r>
-        <w:r>
-          <w:rPr>
-            <w:noProof/>
-            <w:webHidden/>
-          </w:rPr>
-          <w:fldChar w:fldCharType="end"/>
-        </w:r>
-      </w:hyperlink>
-    </w:p>
-    <w:p>
-      <w:pPr>
-        <w:pStyle w:val="TOC2"/>
-        <w:tabs>
-          <w:tab w:val="right" w:leader="dot" w:pos="9016"/>
-        </w:tabs>
-        <w:rPr>
-          <w:noProof/>
-        </w:rPr>
-      </w:pPr>
-      <w:hyperlink w:anchor="_Toc225879155" w:history="1">
-        <w:r>
-          <w:rPr>
-            <w:rStyle w:val="Hyperlink"/>
-            <w:noProof/>
-          </w:rPr>
-          <w:t>1.2 Theoretical Frameworks</w:t>
-        </w:r>
-        <w:r>
-          <w:rPr>
-            <w:noProof/>
-            <w:webHidden/>
-          </w:rPr>
-          <w:tab/>
-        </w:r>
-        <w:r>
-          <w:rPr>
-            <w:noProof/>
-            <w:webHidden/>
-          </w:rPr>
-          <w:fldChar w:fldCharType="begin"/>
-        </w:r>
-        <w:r>
-          <w:rPr>
-            <w:noProof/>
-            <w:webHidden/>
-          </w:rPr>
-          <w:instrText xml:space="preserve"> PAGEREF _Toc225879155 \h </w:instrText>
-        </w:r>
-        <w:r>
-          <w:rPr>
-            <w:noProof/>
-            <w:webHidden/>
-          </w:rPr>
-        </w:r>
-        <w:r>
-          <w:rPr>
-            <w:noProof/>
-            <w:webHidden/>
-          </w:rPr>
-          <w:fldChar w:fldCharType="separate"/>
-        </w:r>
-        <w:r>
-          <w:rPr>
-            <w:noProof/>
-            <w:webHidden/>
-          </w:rPr>
-          <w:t>13</w:t>
-        </w:r>
-        <w:r>
-          <w:rPr>
-            <w:noProof/>
-            <w:webHidden/>
-          </w:rPr>
-          <w:fldChar w:fldCharType="end"/>
-        </w:r>
-      </w:hyperlink>
-    </w:p>
-    <w:p>
-      <w:pPr>
-        <w:pStyle w:val="TOC2"/>
-        <w:tabs>
-          <w:tab w:val="right" w:leader="dot" w:pos="9016"/>
-        </w:tabs>
-        <w:rPr>
-          <w:noProof/>
-        </w:rPr>
-      </w:pPr>
-      <w:hyperlink w:anchor="_Toc225879156" w:history="1">
+      <w:hyperlink w:anchor="_Toc225985153" w:history="1">
         <w:r>
           <w:rPr>
             <w:rStyle w:val="Hyperlink"/>
@@ -870,7 +687,75 @@
             <w:noProof/>
             <w:webHidden/>
           </w:rPr>
-          <w:instrText xml:space="preserve"> PAGEREF _Toc225879156 \h </w:instrText>
+          <w:instrText xml:space="preserve"> PAGEREF _Toc225985153 \h </w:instrText>
+        </w:r>
+        <w:r>
+          <w:rPr>
+            <w:noProof/>
+            <w:webHidden/>
+          </w:rPr>
+        </w:r>
+        <w:r>
+          <w:rPr>
+            <w:noProof/>
+            <w:webHidden/>
+          </w:rPr>
+          <w:fldChar w:fldCharType="separate"/>
+        </w:r>
+        <w:r>
+          <w:rPr>
+            <w:noProof/>
+            <w:webHidden/>
+          </w:rPr>
+          <w:t>15</w:t>
+        </w:r>
+        <w:r>
+          <w:rPr>
+            <w:noProof/>
+            <w:webHidden/>
+          </w:rPr>
+          <w:fldChar w:fldCharType="end"/>
+        </w:r>
+      </w:hyperlink>
+    </w:p>
+    <w:p>
+      <w:pPr>
+        <w:pStyle w:val="TOC2"/>
+        <w:tabs>
+          <w:tab w:val="right" w:leader="dot" w:pos="9016"/>
+        </w:tabs>
+        <w:rPr>
+          <w:noProof/>
+        </w:rPr>
+      </w:pPr>
+      <w:hyperlink w:anchor="_Toc225985154" w:history="1">
+        <w:r>
+          <w:rPr>
+            <w:rStyle w:val="Hyperlink"/>
+            <w:noProof/>
+          </w:rPr>
+          <w:t>1.4 Social Media Platforms as Sources of Health Information</w:t>
+        </w:r>
+        <w:r>
+          <w:rPr>
+            <w:noProof/>
+            <w:webHidden/>
+          </w:rPr>
+          <w:tab/>
+        </w:r>
+        <w:r>
+          <w:rPr>
+            <w:noProof/>
+            <w:webHidden/>
+          </w:rPr>
+          <w:fldChar w:fldCharType="begin"/>
+        </w:r>
+        <w:r>
+          <w:rPr>
+            <w:noProof/>
+            <w:webHidden/>
+          </w:rPr>
+          <w:instrText xml:space="preserve"> PAGEREF _Toc225985154 \h </w:instrText>
         </w:r>
         <w:r>
           <w:rPr>
@@ -911,13 +796,13 @@
           <w:noProof/>
         </w:rPr>
       </w:pPr>
-      <w:hyperlink w:anchor="_Toc225879157" w:history="1">
+      <w:hyperlink w:anchor="_Toc225985155" w:history="1">
         <w:r>
           <w:rPr>
             <w:rStyle w:val="Hyperlink"/>
             <w:noProof/>
           </w:rPr>
-          <w:t>1.4 Social Media Platforms as Sources of Health Information</w:t>
+          <w:t>1.5 Quality Assessment Tools and Cross-Platform Applicability</w:t>
         </w:r>
         <w:r>
           <w:rPr>
@@ -938,7 +823,7 @@
             <w:noProof/>
             <w:webHidden/>
           </w:rPr>
-          <w:instrText xml:space="preserve"> PAGEREF _Toc225879157 \h </w:instrText>
+          <w:instrText xml:space="preserve"> PAGEREF _Toc225985155 \h </w:instrText>
         </w:r>
         <w:r>
           <w:rPr>
@@ -979,75 +864,7 @@
           <w:noProof/>
         </w:rPr>
       </w:pPr>
-      <w:hyperlink w:anchor="_Toc225879158" w:history="1">
-        <w:r>
-          <w:rPr>
-            <w:rStyle w:val="Hyperlink"/>
-            <w:noProof/>
-          </w:rPr>
-          <w:t>1.5 Quality Assessment Tools and Cross-Platform Applicability</w:t>
-        </w:r>
-        <w:r>
-          <w:rPr>
-            <w:noProof/>
-            <w:webHidden/>
-          </w:rPr>
-          <w:tab/>
-        </w:r>
-        <w:r>
-          <w:rPr>
-            <w:noProof/>
-            <w:webHidden/>
-          </w:rPr>
-          <w:fldChar w:fldCharType="begin"/>
-        </w:r>
-        <w:r>
-          <w:rPr>
-            <w:noProof/>
-            <w:webHidden/>
-          </w:rPr>
-          <w:instrText xml:space="preserve"> PAGEREF _Toc225879158 \h </w:instrText>
-        </w:r>
-        <w:r>
-          <w:rPr>
-            <w:noProof/>
-            <w:webHidden/>
-          </w:rPr>
-        </w:r>
-        <w:r>
-          <w:rPr>
-            <w:noProof/>
-            <w:webHidden/>
-          </w:rPr>
-          <w:fldChar w:fldCharType="separate"/>
-        </w:r>
-        <w:r>
-          <w:rPr>
-            <w:noProof/>
-            <w:webHidden/>
-          </w:rPr>
-          <w:t>18</w:t>
-        </w:r>
-        <w:r>
-          <w:rPr>
-            <w:noProof/>
-            <w:webHidden/>
-          </w:rPr>
-          <w:fldChar w:fldCharType="end"/>
-        </w:r>
-      </w:hyperlink>
-    </w:p>
-    <w:p>
-      <w:pPr>
-        <w:pStyle w:val="TOC2"/>
-        <w:tabs>
-          <w:tab w:val="right" w:leader="dot" w:pos="9016"/>
-        </w:tabs>
-        <w:rPr>
-          <w:noProof/>
-        </w:rPr>
-      </w:pPr>
-      <w:hyperlink w:anchor="_Toc225879159" w:history="1">
+      <w:hyperlink w:anchor="_Toc225985156" w:history="1">
         <w:r>
           <w:rPr>
             <w:rStyle w:val="Hyperlink"/>
@@ -1074,7 +891,7 @@
             <w:noProof/>
             <w:webHidden/>
           </w:rPr>
-          <w:instrText xml:space="preserve"> PAGEREF _Toc225879159 \h </w:instrText>
+          <w:instrText xml:space="preserve"> PAGEREF _Toc225985156 \h </w:instrText>
         </w:r>
         <w:r>
           <w:rPr>
@@ -1094,7 +911,7 @@
             <w:noProof/>
             <w:webHidden/>
           </w:rPr>
-          <w:t>20</w:t>
+          <w:t>19</w:t>
         </w:r>
         <w:r>
           <w:rPr>
@@ -1115,7 +932,7 @@
           <w:noProof/>
         </w:rPr>
       </w:pPr>
-      <w:hyperlink w:anchor="_Toc225879160" w:history="1">
+      <w:hyperlink w:anchor="_Toc225985157" w:history="1">
         <w:r>
           <w:rPr>
             <w:rStyle w:val="Hyperlink"/>
@@ -1142,7 +959,7 @@
             <w:noProof/>
             <w:webHidden/>
           </w:rPr>
-          <w:instrText xml:space="preserve"> PAGEREF _Toc225879160 \h </w:instrText>
+          <w:instrText xml:space="preserve"> PAGEREF _Toc225985157 \h </w:instrText>
         </w:r>
         <w:r>
           <w:rPr>
@@ -1162,7 +979,7 @@
             <w:noProof/>
             <w:webHidden/>
           </w:rPr>
-          <w:t>22</w:t>
+          <w:t>21</w:t>
         </w:r>
         <w:r>
           <w:rPr>
@@ -1183,7 +1000,7 @@
           <w:noProof/>
         </w:rPr>
       </w:pPr>
-      <w:hyperlink w:anchor="_Toc225879161" w:history="1">
+      <w:hyperlink w:anchor="_Toc225985158" w:history="1">
         <w:r>
           <w:rPr>
             <w:rStyle w:val="Hyperlink"/>
@@ -1211,7 +1028,214 @@
             <w:noProof/>
             <w:webHidden/>
           </w:rPr>
-          <w:instrText xml:space="preserve"> PAGEREF _Toc225879161 \h </w:instrText>
+          <w:instrText xml:space="preserve"> PAGEREF _Toc225985158 \h </w:instrText>
+        </w:r>
+        <w:r>
+          <w:rPr>
+            <w:noProof/>
+            <w:webHidden/>
+          </w:rPr>
+        </w:r>
+        <w:r>
+          <w:rPr>
+            <w:noProof/>
+            <w:webHidden/>
+          </w:rPr>
+          <w:fldChar w:fldCharType="separate"/>
+        </w:r>
+        <w:r>
+          <w:rPr>
+            <w:noProof/>
+            <w:webHidden/>
+          </w:rPr>
+          <w:t>23</w:t>
+        </w:r>
+        <w:r>
+          <w:rPr>
+            <w:noProof/>
+            <w:webHidden/>
+          </w:rPr>
+          <w:fldChar w:fldCharType="end"/>
+        </w:r>
+      </w:hyperlink>
+    </w:p>
+    <w:p>
+      <w:pPr>
+        <w:pStyle w:val="TOC2"/>
+        <w:tabs>
+          <w:tab w:val="right" w:leader="dot" w:pos="9016"/>
+        </w:tabs>
+        <w:rPr>
+          <w:noProof/>
+        </w:rPr>
+      </w:pPr>
+      <w:hyperlink w:anchor="_Toc225985159" w:history="1">
+        <w:r>
+          <w:rPr>
+            <w:rStyle w:val="Hyperlink"/>
+            <w:rFonts w:cs="Times New Roman"/>
+            <w:noProof/>
+          </w:rPr>
+          <w:t>2.1 Research Object</w:t>
+        </w:r>
+        <w:r>
+          <w:rPr>
+            <w:noProof/>
+            <w:webHidden/>
+          </w:rPr>
+          <w:tab/>
+        </w:r>
+        <w:r>
+          <w:rPr>
+            <w:noProof/>
+            <w:webHidden/>
+          </w:rPr>
+          <w:fldChar w:fldCharType="begin"/>
+        </w:r>
+        <w:r>
+          <w:rPr>
+            <w:noProof/>
+            <w:webHidden/>
+          </w:rPr>
+          <w:instrText xml:space="preserve"> PAGEREF _Toc225985159 \h </w:instrText>
+        </w:r>
+        <w:r>
+          <w:rPr>
+            <w:noProof/>
+            <w:webHidden/>
+          </w:rPr>
+        </w:r>
+        <w:r>
+          <w:rPr>
+            <w:noProof/>
+            <w:webHidden/>
+          </w:rPr>
+          <w:fldChar w:fldCharType="separate"/>
+        </w:r>
+        <w:r>
+          <w:rPr>
+            <w:noProof/>
+            <w:webHidden/>
+          </w:rPr>
+          <w:t>23</w:t>
+        </w:r>
+        <w:r>
+          <w:rPr>
+            <w:noProof/>
+            <w:webHidden/>
+          </w:rPr>
+          <w:fldChar w:fldCharType="end"/>
+        </w:r>
+      </w:hyperlink>
+    </w:p>
+    <w:p>
+      <w:pPr>
+        <w:pStyle w:val="TOC2"/>
+        <w:tabs>
+          <w:tab w:val="right" w:leader="dot" w:pos="9016"/>
+        </w:tabs>
+        <w:rPr>
+          <w:noProof/>
+        </w:rPr>
+      </w:pPr>
+      <w:hyperlink w:anchor="_Toc225985160" w:history="1">
+        <w:r>
+          <w:rPr>
+            <w:rStyle w:val="Hyperlink"/>
+            <w:rFonts w:cs="Times New Roman"/>
+            <w:noProof/>
+          </w:rPr>
+          <w:t>2.2 Research Strategy and Logic</w:t>
+        </w:r>
+        <w:r>
+          <w:rPr>
+            <w:noProof/>
+            <w:webHidden/>
+          </w:rPr>
+          <w:tab/>
+        </w:r>
+        <w:r>
+          <w:rPr>
+            <w:noProof/>
+            <w:webHidden/>
+          </w:rPr>
+          <w:fldChar w:fldCharType="begin"/>
+        </w:r>
+        <w:r>
+          <w:rPr>
+            <w:noProof/>
+            <w:webHidden/>
+          </w:rPr>
+          <w:instrText xml:space="preserve"> PAGEREF _Toc225985160 \h </w:instrText>
+        </w:r>
+        <w:r>
+          <w:rPr>
+            <w:noProof/>
+            <w:webHidden/>
+          </w:rPr>
+        </w:r>
+        <w:r>
+          <w:rPr>
+            <w:noProof/>
+            <w:webHidden/>
+          </w:rPr>
+          <w:fldChar w:fldCharType="separate"/>
+        </w:r>
+        <w:r>
+          <w:rPr>
+            <w:noProof/>
+            <w:webHidden/>
+          </w:rPr>
+          <w:t>23</w:t>
+        </w:r>
+        <w:r>
+          <w:rPr>
+            <w:noProof/>
+            <w:webHidden/>
+          </w:rPr>
+          <w:fldChar w:fldCharType="end"/>
+        </w:r>
+      </w:hyperlink>
+    </w:p>
+    <w:p>
+      <w:pPr>
+        <w:pStyle w:val="TOC2"/>
+        <w:tabs>
+          <w:tab w:val="right" w:leader="dot" w:pos="9016"/>
+        </w:tabs>
+        <w:rPr>
+          <w:noProof/>
+        </w:rPr>
+      </w:pPr>
+      <w:hyperlink w:anchor="_Toc225985161" w:history="1">
+        <w:r>
+          <w:rPr>
+            <w:rStyle w:val="Hyperlink"/>
+            <w:rFonts w:cs="Times New Roman"/>
+            <w:noProof/>
+          </w:rPr>
+          <w:t>2.3 Nature of Research</w:t>
+        </w:r>
+        <w:r>
+          <w:rPr>
+            <w:noProof/>
+            <w:webHidden/>
+          </w:rPr>
+          <w:tab/>
+        </w:r>
+        <w:r>
+          <w:rPr>
+            <w:noProof/>
+            <w:webHidden/>
+          </w:rPr>
+          <w:fldChar w:fldCharType="begin"/>
+        </w:r>
+        <w:r>
+          <w:rPr>
+            <w:noProof/>
+            <w:webHidden/>
+          </w:rPr>
+          <w:instrText xml:space="preserve"> PAGEREF _Toc225985161 \h </w:instrText>
         </w:r>
         <w:r>
           <w:rPr>
@@ -1252,14 +1276,14 @@
           <w:noProof/>
         </w:rPr>
       </w:pPr>
-      <w:hyperlink w:anchor="_Toc225879162" w:history="1">
+      <w:hyperlink w:anchor="_Toc225985162" w:history="1">
         <w:r>
           <w:rPr>
             <w:rStyle w:val="Hyperlink"/>
             <w:rFonts w:cs="Times New Roman"/>
             <w:noProof/>
           </w:rPr>
-          <w:t>2.1 Research Object</w:t>
+          <w:t>2.4 Study Sample and Sampling Frame</w:t>
         </w:r>
         <w:r>
           <w:rPr>
@@ -1280,145 +1304,7 @@
             <w:noProof/>
             <w:webHidden/>
           </w:rPr>
-          <w:instrText xml:space="preserve"> PAGEREF _Toc225879162 \h </w:instrText>
-        </w:r>
-        <w:r>
-          <w:rPr>
-            <w:noProof/>
-            <w:webHidden/>
-          </w:rPr>
-        </w:r>
-        <w:r>
-          <w:rPr>
-            <w:noProof/>
-            <w:webHidden/>
-          </w:rPr>
-          <w:fldChar w:fldCharType="separate"/>
-        </w:r>
-        <w:r>
-          <w:rPr>
-            <w:noProof/>
-            <w:webHidden/>
-          </w:rPr>
-          <w:t>24</w:t>
-        </w:r>
-        <w:r>
-          <w:rPr>
-            <w:noProof/>
-            <w:webHidden/>
-          </w:rPr>
-          <w:fldChar w:fldCharType="end"/>
-        </w:r>
-      </w:hyperlink>
-    </w:p>
-    <w:p>
-      <w:pPr>
-        <w:pStyle w:val="TOC2"/>
-        <w:tabs>
-          <w:tab w:val="right" w:leader="dot" w:pos="9016"/>
-        </w:tabs>
-        <w:rPr>
-          <w:noProof/>
-        </w:rPr>
-      </w:pPr>
-      <w:hyperlink w:anchor="_Toc225879163" w:history="1">
-        <w:r>
-          <w:rPr>
-            <w:rStyle w:val="Hyperlink"/>
-            <w:rFonts w:cs="Times New Roman"/>
-            <w:noProof/>
-          </w:rPr>
-          <w:t>2.2 Research Strategy and Logic</w:t>
-        </w:r>
-        <w:r>
-          <w:rPr>
-            <w:noProof/>
-            <w:webHidden/>
-          </w:rPr>
-          <w:tab/>
-        </w:r>
-        <w:r>
-          <w:rPr>
-            <w:noProof/>
-            <w:webHidden/>
-          </w:rPr>
-          <w:fldChar w:fldCharType="begin"/>
-        </w:r>
-        <w:r>
-          <w:rPr>
-            <w:noProof/>
-            <w:webHidden/>
-          </w:rPr>
-          <w:instrText xml:space="preserve"> PAGEREF _Toc225879163 \h </w:instrText>
-        </w:r>
-        <w:r>
-          <w:rPr>
-            <w:noProof/>
-            <w:webHidden/>
-          </w:rPr>
-        </w:r>
-        <w:r>
-          <w:rPr>
-            <w:noProof/>
-            <w:webHidden/>
-          </w:rPr>
-          <w:fldChar w:fldCharType="separate"/>
-        </w:r>
-        <w:r>
-          <w:rPr>
-            <w:noProof/>
-            <w:webHidden/>
-          </w:rPr>
-          <w:t>24</w:t>
-        </w:r>
-        <w:r>
-          <w:rPr>
-            <w:noProof/>
-            <w:webHidden/>
-          </w:rPr>
-          <w:fldChar w:fldCharType="end"/>
-        </w:r>
-      </w:hyperlink>
-    </w:p>
-    <w:p>
-      <w:pPr>
-        <w:pStyle w:val="TOC2"/>
-        <w:tabs>
-          <w:tab w:val="right" w:leader="dot" w:pos="9016"/>
-        </w:tabs>
-        <w:rPr>
-          <w:noProof/>
-        </w:rPr>
-      </w:pPr>
-      <w:hyperlink w:anchor="_Toc225879164" w:history="1">
-        <w:r>
-          <w:rPr>
-            <w:rStyle w:val="Hyperlink"/>
-            <w:rFonts w:cs="Times New Roman"/>
-            <w:noProof/>
-          </w:rPr>
-          <w:t>2.3 Nature of Research</w:t>
-        </w:r>
-        <w:r>
-          <w:rPr>
-            <w:noProof/>
-            <w:webHidden/>
-          </w:rPr>
-          <w:tab/>
-        </w:r>
-        <w:r>
-          <w:rPr>
-            <w:noProof/>
-            <w:webHidden/>
-          </w:rPr>
-          <w:fldChar w:fldCharType="begin"/>
-        </w:r>
-        <w:r>
-          <w:rPr>
-            <w:noProof/>
-            <w:webHidden/>
-          </w:rPr>
-          <w:instrText xml:space="preserve"> PAGEREF _Toc225879164 \h </w:instrText>
+          <w:instrText xml:space="preserve"> PAGEREF _Toc225985162 \h </w:instrText>
         </w:r>
         <w:r>
           <w:rPr>
@@ -1459,76 +1345,7 @@
           <w:noProof/>
         </w:rPr>
       </w:pPr>
-      <w:hyperlink w:anchor="_Toc225879165" w:history="1">
-        <w:r>
-          <w:rPr>
-            <w:rStyle w:val="Hyperlink"/>
-            <w:rFonts w:cs="Times New Roman"/>
-            <w:noProof/>
-          </w:rPr>
-          <w:t>2.4 Study Sample and Sampling Frame</w:t>
-        </w:r>
-        <w:r>
-          <w:rPr>
-            <w:noProof/>
-            <w:webHidden/>
-          </w:rPr>
-          <w:tab/>
-        </w:r>
-        <w:r>
-          <w:rPr>
-            <w:noProof/>
-            <w:webHidden/>
-          </w:rPr>
-          <w:fldChar w:fldCharType="begin"/>
-        </w:r>
-        <w:r>
-          <w:rPr>
-            <w:noProof/>
-            <w:webHidden/>
-          </w:rPr>
-          <w:instrText xml:space="preserve"> PAGEREF _Toc225879165 \h </w:instrText>
-        </w:r>
-        <w:r>
-          <w:rPr>
-            <w:noProof/>
-            <w:webHidden/>
-          </w:rPr>
-        </w:r>
-        <w:r>
-          <w:rPr>
-            <w:noProof/>
-            <w:webHidden/>
-          </w:rPr>
-          <w:fldChar w:fldCharType="separate"/>
-        </w:r>
-        <w:r>
-          <w:rPr>
-            <w:noProof/>
-            <w:webHidden/>
-          </w:rPr>
-          <w:t>26</w:t>
-        </w:r>
-        <w:r>
-          <w:rPr>
-            <w:noProof/>
-            <w:webHidden/>
-          </w:rPr>
-          <w:fldChar w:fldCharType="end"/>
-        </w:r>
-      </w:hyperlink>
-    </w:p>
-    <w:p>
-      <w:pPr>
-        <w:pStyle w:val="TOC2"/>
-        <w:tabs>
-          <w:tab w:val="right" w:leader="dot" w:pos="9016"/>
-        </w:tabs>
-        <w:rPr>
-          <w:noProof/>
-        </w:rPr>
-      </w:pPr>
-      <w:hyperlink w:anchor="_Toc225879166" w:history="1">
+      <w:hyperlink w:anchor="_Toc225985163" w:history="1">
         <w:r>
           <w:rPr>
             <w:rStyle w:val="Hyperlink"/>
@@ -1556,7 +1373,7 @@
             <w:noProof/>
             <w:webHidden/>
           </w:rPr>
-          <w:instrText xml:space="preserve"> PAGEREF _Toc225879166 \h </w:instrText>
+          <w:instrText xml:space="preserve"> PAGEREF _Toc225985163 \h </w:instrText>
         </w:r>
         <w:r>
           <w:rPr>
@@ -1576,7 +1393,7 @@
             <w:noProof/>
             <w:webHidden/>
           </w:rPr>
-          <w:t>28</w:t>
+          <w:t>27</w:t>
         </w:r>
         <w:r>
           <w:rPr>
@@ -1597,7 +1414,7 @@
           <w:noProof/>
         </w:rPr>
       </w:pPr>
-      <w:hyperlink w:anchor="_Toc225879167" w:history="1">
+      <w:hyperlink w:anchor="_Toc225985164" w:history="1">
         <w:r>
           <w:rPr>
             <w:rStyle w:val="Hyperlink"/>
@@ -1625,7 +1442,7 @@
             <w:noProof/>
             <w:webHidden/>
           </w:rPr>
-          <w:instrText xml:space="preserve"> PAGEREF _Toc225879167 \h </w:instrText>
+          <w:instrText xml:space="preserve"> PAGEREF _Toc225985164 \h </w:instrText>
         </w:r>
         <w:r>
           <w:rPr>
@@ -1645,7 +1462,7 @@
             <w:noProof/>
             <w:webHidden/>
           </w:rPr>
-          <w:t>32</w:t>
+          <w:t>31</w:t>
         </w:r>
         <w:r>
           <w:rPr>
@@ -1666,7 +1483,7 @@
           <w:noProof/>
         </w:rPr>
       </w:pPr>
-      <w:hyperlink w:anchor="_Toc225879168" w:history="1">
+      <w:hyperlink w:anchor="_Toc225985165" w:history="1">
         <w:r>
           <w:rPr>
             <w:rStyle w:val="Hyperlink"/>
@@ -1694,7 +1511,7 @@
             <w:noProof/>
             <w:webHidden/>
           </w:rPr>
-          <w:instrText xml:space="preserve"> PAGEREF _Toc225879168 \h </w:instrText>
+          <w:instrText xml:space="preserve"> PAGEREF _Toc225985165 \h </w:instrText>
         </w:r>
         <w:r>
           <w:rPr>
@@ -1714,7 +1531,7 @@
             <w:noProof/>
             <w:webHidden/>
           </w:rPr>
-          <w:t>35</w:t>
+          <w:t>34</w:t>
         </w:r>
         <w:r>
           <w:rPr>
@@ -1735,7 +1552,7 @@
           <w:noProof/>
         </w:rPr>
       </w:pPr>
-      <w:hyperlink w:anchor="_Toc225879169" w:history="1">
+      <w:hyperlink w:anchor="_Toc225985166" w:history="1">
         <w:r>
           <w:rPr>
             <w:rStyle w:val="Hyperlink"/>
@@ -1763,7 +1580,145 @@
             <w:noProof/>
             <w:webHidden/>
           </w:rPr>
-          <w:instrText xml:space="preserve"> PAGEREF _Toc225879169 \h </w:instrText>
+          <w:instrText xml:space="preserve"> PAGEREF _Toc225985166 \h </w:instrText>
+        </w:r>
+        <w:r>
+          <w:rPr>
+            <w:noProof/>
+            <w:webHidden/>
+          </w:rPr>
+        </w:r>
+        <w:r>
+          <w:rPr>
+            <w:noProof/>
+            <w:webHidden/>
+          </w:rPr>
+          <w:fldChar w:fldCharType="separate"/>
+        </w:r>
+        <w:r>
+          <w:rPr>
+            <w:noProof/>
+            <w:webHidden/>
+          </w:rPr>
+          <w:t>38</w:t>
+        </w:r>
+        <w:r>
+          <w:rPr>
+            <w:noProof/>
+            <w:webHidden/>
+          </w:rPr>
+          <w:fldChar w:fldCharType="end"/>
+        </w:r>
+      </w:hyperlink>
+    </w:p>
+    <w:p>
+      <w:pPr>
+        <w:pStyle w:val="TOC2"/>
+        <w:tabs>
+          <w:tab w:val="right" w:leader="dot" w:pos="9016"/>
+        </w:tabs>
+        <w:rPr>
+          <w:noProof/>
+        </w:rPr>
+      </w:pPr>
+      <w:hyperlink w:anchor="_Toc225985167" w:history="1">
+        <w:r>
+          <w:rPr>
+            <w:rStyle w:val="Hyperlink"/>
+            <w:rFonts w:cs="Times New Roman"/>
+            <w:noProof/>
+          </w:rPr>
+          <w:t>3.1 Sample Characteristics</w:t>
+        </w:r>
+        <w:r>
+          <w:rPr>
+            <w:noProof/>
+            <w:webHidden/>
+          </w:rPr>
+          <w:tab/>
+        </w:r>
+        <w:r>
+          <w:rPr>
+            <w:noProof/>
+            <w:webHidden/>
+          </w:rPr>
+          <w:fldChar w:fldCharType="begin"/>
+        </w:r>
+        <w:r>
+          <w:rPr>
+            <w:noProof/>
+            <w:webHidden/>
+          </w:rPr>
+          <w:instrText xml:space="preserve"> PAGEREF _Toc225985167 \h </w:instrText>
+        </w:r>
+        <w:r>
+          <w:rPr>
+            <w:noProof/>
+            <w:webHidden/>
+          </w:rPr>
+        </w:r>
+        <w:r>
+          <w:rPr>
+            <w:noProof/>
+            <w:webHidden/>
+          </w:rPr>
+          <w:fldChar w:fldCharType="separate"/>
+        </w:r>
+        <w:r>
+          <w:rPr>
+            <w:noProof/>
+            <w:webHidden/>
+          </w:rPr>
+          <w:t>38</w:t>
+        </w:r>
+        <w:r>
+          <w:rPr>
+            <w:noProof/>
+            <w:webHidden/>
+          </w:rPr>
+          <w:fldChar w:fldCharType="end"/>
+        </w:r>
+      </w:hyperlink>
+    </w:p>
+    <w:p>
+      <w:pPr>
+        <w:pStyle w:val="TOC2"/>
+        <w:tabs>
+          <w:tab w:val="right" w:leader="dot" w:pos="9016"/>
+        </w:tabs>
+        <w:rPr>
+          <w:noProof/>
+        </w:rPr>
+      </w:pPr>
+      <w:hyperlink w:anchor="_Toc225985168" w:history="1">
+        <w:r>
+          <w:rPr>
+            <w:rStyle w:val="Hyperlink"/>
+            <w:rFonts w:cs="Times New Roman"/>
+            <w:noProof/>
+          </w:rPr>
+          <w:t>3.2 Inter-Rater Reliability</w:t>
+        </w:r>
+        <w:r>
+          <w:rPr>
+            <w:noProof/>
+            <w:webHidden/>
+          </w:rPr>
+          <w:tab/>
+        </w:r>
+        <w:r>
+          <w:rPr>
+            <w:noProof/>
+            <w:webHidden/>
+          </w:rPr>
+          <w:fldChar w:fldCharType="begin"/>
+        </w:r>
+        <w:r>
+          <w:rPr>
+            <w:noProof/>
+            <w:webHidden/>
+          </w:rPr>
+          <w:instrText xml:space="preserve"> PAGEREF _Toc225985168 \h </w:instrText>
         </w:r>
         <w:r>
           <w:rPr>
@@ -1804,14 +1759,14 @@
           <w:noProof/>
         </w:rPr>
       </w:pPr>
-      <w:hyperlink w:anchor="_Toc225879170" w:history="1">
+      <w:hyperlink w:anchor="_Toc225985169" w:history="1">
         <w:r>
           <w:rPr>
             <w:rStyle w:val="Hyperlink"/>
             <w:rFonts w:cs="Times New Roman"/>
             <w:noProof/>
           </w:rPr>
-          <w:t>3.1 Sample Characteristics</w:t>
+          <w:t>3.3 DISCERN Scores by Platform</w:t>
         </w:r>
         <w:r>
           <w:rPr>
@@ -1832,7 +1787,7 @@
             <w:noProof/>
             <w:webHidden/>
           </w:rPr>
-          <w:instrText xml:space="preserve"> PAGEREF _Toc225879170 \h </w:instrText>
+          <w:instrText xml:space="preserve"> PAGEREF _Toc225985169 \h </w:instrText>
         </w:r>
         <w:r>
           <w:rPr>
@@ -1873,145 +1828,7 @@
           <w:noProof/>
         </w:rPr>
       </w:pPr>
-      <w:hyperlink w:anchor="_Toc225879171" w:history="1">
-        <w:r>
-          <w:rPr>
-            <w:rStyle w:val="Hyperlink"/>
-            <w:rFonts w:cs="Times New Roman"/>
-            <w:noProof/>
-          </w:rPr>
-          <w:t>3.2 Inter-Rater Reliability</w:t>
-        </w:r>
-        <w:r>
-          <w:rPr>
-            <w:noProof/>
-            <w:webHidden/>
-          </w:rPr>
-          <w:tab/>
-        </w:r>
-        <w:r>
-          <w:rPr>
-            <w:noProof/>
-            <w:webHidden/>
-          </w:rPr>
-          <w:fldChar w:fldCharType="begin"/>
-        </w:r>
-        <w:r>
-          <w:rPr>
-            <w:noProof/>
-            <w:webHidden/>
-          </w:rPr>
-          <w:instrText xml:space="preserve"> PAGEREF _Toc225879171 \h </w:instrText>
-        </w:r>
-        <w:r>
-          <w:rPr>
-            <w:noProof/>
-            <w:webHidden/>
-          </w:rPr>
-        </w:r>
-        <w:r>
-          <w:rPr>
-            <w:noProof/>
-            <w:webHidden/>
-          </w:rPr>
-          <w:fldChar w:fldCharType="separate"/>
-        </w:r>
-        <w:r>
-          <w:rPr>
-            <w:noProof/>
-            <w:webHidden/>
-          </w:rPr>
-          <w:t>40</w:t>
-        </w:r>
-        <w:r>
-          <w:rPr>
-            <w:noProof/>
-            <w:webHidden/>
-          </w:rPr>
-          <w:fldChar w:fldCharType="end"/>
-        </w:r>
-      </w:hyperlink>
-    </w:p>
-    <w:p>
-      <w:pPr>
-        <w:pStyle w:val="TOC2"/>
-        <w:tabs>
-          <w:tab w:val="right" w:leader="dot" w:pos="9016"/>
-        </w:tabs>
-        <w:rPr>
-          <w:noProof/>
-        </w:rPr>
-      </w:pPr>
-      <w:hyperlink w:anchor="_Toc225879172" w:history="1">
-        <w:r>
-          <w:rPr>
-            <w:rStyle w:val="Hyperlink"/>
-            <w:rFonts w:cs="Times New Roman"/>
-            <w:noProof/>
-          </w:rPr>
-          <w:t>3.3 DISCERN Scores by Platform</w:t>
-        </w:r>
-        <w:r>
-          <w:rPr>
-            <w:noProof/>
-            <w:webHidden/>
-          </w:rPr>
-          <w:tab/>
-        </w:r>
-        <w:r>
-          <w:rPr>
-            <w:noProof/>
-            <w:webHidden/>
-          </w:rPr>
-          <w:fldChar w:fldCharType="begin"/>
-        </w:r>
-        <w:r>
-          <w:rPr>
-            <w:noProof/>
-            <w:webHidden/>
-          </w:rPr>
-          <w:instrText xml:space="preserve"> PAGEREF _Toc225879172 \h </w:instrText>
-        </w:r>
-        <w:r>
-          <w:rPr>
-            <w:noProof/>
-            <w:webHidden/>
-          </w:rPr>
-        </w:r>
-        <w:r>
-          <w:rPr>
-            <w:noProof/>
-            <w:webHidden/>
-          </w:rPr>
-          <w:fldChar w:fldCharType="separate"/>
-        </w:r>
-        <w:r>
-          <w:rPr>
-            <w:noProof/>
-            <w:webHidden/>
-          </w:rPr>
-          <w:t>40</w:t>
-        </w:r>
-        <w:r>
-          <w:rPr>
-            <w:noProof/>
-            <w:webHidden/>
-          </w:rPr>
-          <w:fldChar w:fldCharType="end"/>
-        </w:r>
-      </w:hyperlink>
-    </w:p>
-    <w:p>
-      <w:pPr>
-        <w:pStyle w:val="TOC2"/>
-        <w:tabs>
-          <w:tab w:val="right" w:leader="dot" w:pos="9016"/>
-        </w:tabs>
-        <w:rPr>
-          <w:noProof/>
-        </w:rPr>
-      </w:pPr>
-      <w:hyperlink w:anchor="_Toc225879173" w:history="1">
+      <w:hyperlink w:anchor="_Toc225985170" w:history="1">
         <w:r>
           <w:rPr>
             <w:rStyle w:val="Hyperlink"/>
@@ -2039,7 +1856,76 @@
             <w:noProof/>
             <w:webHidden/>
           </w:rPr>
-          <w:instrText xml:space="preserve"> PAGEREF _Toc225879173 \h </w:instrText>
+          <w:instrText xml:space="preserve"> PAGEREF _Toc225985170 \h </w:instrText>
+        </w:r>
+        <w:r>
+          <w:rPr>
+            <w:noProof/>
+            <w:webHidden/>
+          </w:rPr>
+        </w:r>
+        <w:r>
+          <w:rPr>
+            <w:noProof/>
+            <w:webHidden/>
+          </w:rPr>
+          <w:fldChar w:fldCharType="separate"/>
+        </w:r>
+        <w:r>
+          <w:rPr>
+            <w:noProof/>
+            <w:webHidden/>
+          </w:rPr>
+          <w:t>42</w:t>
+        </w:r>
+        <w:r>
+          <w:rPr>
+            <w:noProof/>
+            <w:webHidden/>
+          </w:rPr>
+          <w:fldChar w:fldCharType="end"/>
+        </w:r>
+      </w:hyperlink>
+    </w:p>
+    <w:p>
+      <w:pPr>
+        <w:pStyle w:val="TOC2"/>
+        <w:tabs>
+          <w:tab w:val="right" w:leader="dot" w:pos="9016"/>
+        </w:tabs>
+        <w:rPr>
+          <w:noProof/>
+        </w:rPr>
+      </w:pPr>
+      <w:hyperlink w:anchor="_Toc225985171" w:history="1">
+        <w:r>
+          <w:rPr>
+            <w:rStyle w:val="Hyperlink"/>
+            <w:rFonts w:cs="Times New Roman"/>
+            <w:noProof/>
+          </w:rPr>
+          <w:t>3.5 Creator Type Analysis</w:t>
+        </w:r>
+        <w:r>
+          <w:rPr>
+            <w:noProof/>
+            <w:webHidden/>
+          </w:rPr>
+          <w:tab/>
+        </w:r>
+        <w:r>
+          <w:rPr>
+            <w:noProof/>
+            <w:webHidden/>
+          </w:rPr>
+          <w:fldChar w:fldCharType="begin"/>
+        </w:r>
+        <w:r>
+          <w:rPr>
+            <w:noProof/>
+            <w:webHidden/>
+          </w:rPr>
+          <w:instrText xml:space="preserve"> PAGEREF _Toc225985171 \h </w:instrText>
         </w:r>
         <w:r>
           <w:rPr>
@@ -2080,14 +1966,14 @@
           <w:noProof/>
         </w:rPr>
       </w:pPr>
-      <w:hyperlink w:anchor="_Toc225879174" w:history="1">
+      <w:hyperlink w:anchor="_Toc225985172" w:history="1">
         <w:r>
           <w:rPr>
             <w:rStyle w:val="Hyperlink"/>
             <w:rFonts w:cs="Times New Roman"/>
             <w:noProof/>
           </w:rPr>
-          <w:t>3.5 Creator Type Analysis</w:t>
+          <w:t>3.6 Engagement-Quality Relationship</w:t>
         </w:r>
         <w:r>
           <w:rPr>
@@ -2108,7 +1994,7 @@
             <w:noProof/>
             <w:webHidden/>
           </w:rPr>
-          <w:instrText xml:space="preserve"> PAGEREF _Toc225879174 \h </w:instrText>
+          <w:instrText xml:space="preserve"> PAGEREF _Toc225985172 \h </w:instrText>
         </w:r>
         <w:r>
           <w:rPr>
@@ -2149,76 +2035,7 @@
           <w:noProof/>
         </w:rPr>
       </w:pPr>
-      <w:hyperlink w:anchor="_Toc225879175" w:history="1">
-        <w:r>
-          <w:rPr>
-            <w:rStyle w:val="Hyperlink"/>
-            <w:rFonts w:cs="Times New Roman"/>
-            <w:noProof/>
-          </w:rPr>
-          <w:t>3.6 Engagement-Quality Relationship</w:t>
-        </w:r>
-        <w:r>
-          <w:rPr>
-            <w:noProof/>
-            <w:webHidden/>
-          </w:rPr>
-          <w:tab/>
-        </w:r>
-        <w:r>
-          <w:rPr>
-            <w:noProof/>
-            <w:webHidden/>
-          </w:rPr>
-          <w:fldChar w:fldCharType="begin"/>
-        </w:r>
-        <w:r>
-          <w:rPr>
-            <w:noProof/>
-            <w:webHidden/>
-          </w:rPr>
-          <w:instrText xml:space="preserve"> PAGEREF _Toc225879175 \h </w:instrText>
-        </w:r>
-        <w:r>
-          <w:rPr>
-            <w:noProof/>
-            <w:webHidden/>
-          </w:rPr>
-        </w:r>
-        <w:r>
-          <w:rPr>
-            <w:noProof/>
-            <w:webHidden/>
-          </w:rPr>
-          <w:fldChar w:fldCharType="separate"/>
-        </w:r>
-        <w:r>
-          <w:rPr>
-            <w:noProof/>
-            <w:webHidden/>
-          </w:rPr>
-          <w:t>45</w:t>
-        </w:r>
-        <w:r>
-          <w:rPr>
-            <w:noProof/>
-            <w:webHidden/>
-          </w:rPr>
-          <w:fldChar w:fldCharType="end"/>
-        </w:r>
-      </w:hyperlink>
-    </w:p>
-    <w:p>
-      <w:pPr>
-        <w:pStyle w:val="TOC2"/>
-        <w:tabs>
-          <w:tab w:val="right" w:leader="dot" w:pos="9016"/>
-        </w:tabs>
-        <w:rPr>
-          <w:noProof/>
-        </w:rPr>
-      </w:pPr>
-      <w:hyperlink w:anchor="_Toc225879176" w:history="1">
+      <w:hyperlink w:anchor="_Toc225985173" w:history="1">
         <w:r>
           <w:rPr>
             <w:rStyle w:val="Hyperlink"/>
@@ -2246,7 +2063,7 @@
             <w:noProof/>
             <w:webHidden/>
           </w:rPr>
-          <w:instrText xml:space="preserve"> PAGEREF _Toc225879176 \h </w:instrText>
+          <w:instrText xml:space="preserve"> PAGEREF _Toc225985173 \h </w:instrText>
         </w:r>
         <w:r>
           <w:rPr>
@@ -2266,7 +2083,7 @@
             <w:noProof/>
             <w:webHidden/>
           </w:rPr>
-          <w:t>47</w:t>
+          <w:t>46</w:t>
         </w:r>
         <w:r>
           <w:rPr>
@@ -2287,7 +2104,7 @@
           <w:noProof/>
         </w:rPr>
       </w:pPr>
-      <w:hyperlink w:anchor="_Toc225879177" w:history="1">
+      <w:hyperlink w:anchor="_Toc225985174" w:history="1">
         <w:r>
           <w:rPr>
             <w:rStyle w:val="Hyperlink"/>
@@ -2315,7 +2132,7 @@
             <w:noProof/>
             <w:webHidden/>
           </w:rPr>
-          <w:instrText xml:space="preserve"> PAGEREF _Toc225879177 \h </w:instrText>
+          <w:instrText xml:space="preserve"> PAGEREF _Toc225985174 \h </w:instrText>
         </w:r>
         <w:r>
           <w:rPr>
@@ -2335,7 +2152,7 @@
             <w:noProof/>
             <w:webHidden/>
           </w:rPr>
-          <w:t>47</w:t>
+          <w:t>46</w:t>
         </w:r>
         <w:r>
           <w:rPr>
@@ -2356,7 +2173,7 @@
           <w:noProof/>
         </w:rPr>
       </w:pPr>
-      <w:hyperlink w:anchor="_Toc225879178" w:history="1">
+      <w:hyperlink w:anchor="_Toc225985175" w:history="1">
         <w:r>
           <w:rPr>
             <w:rStyle w:val="Hyperlink"/>
@@ -2384,7 +2201,7 @@
             <w:noProof/>
             <w:webHidden/>
           </w:rPr>
-          <w:instrText xml:space="preserve"> PAGEREF _Toc225879178 \h </w:instrText>
+          <w:instrText xml:space="preserve"> PAGEREF _Toc225985175 \h </w:instrText>
         </w:r>
         <w:r>
           <w:rPr>
@@ -2404,7 +2221,7 @@
             <w:noProof/>
             <w:webHidden/>
           </w:rPr>
-          <w:t>49</w:t>
+          <w:t>48</w:t>
         </w:r>
         <w:r>
           <w:rPr>
@@ -2425,7 +2242,7 @@
           <w:noProof/>
         </w:rPr>
       </w:pPr>
-      <w:hyperlink w:anchor="_Toc225879179" w:history="1">
+      <w:hyperlink w:anchor="_Toc225985176" w:history="1">
         <w:r>
           <w:rPr>
             <w:rStyle w:val="Hyperlink"/>
@@ -2453,7 +2270,7 @@
             <w:noProof/>
             <w:webHidden/>
           </w:rPr>
-          <w:instrText xml:space="preserve"> PAGEREF _Toc225879179 \h </w:instrText>
+          <w:instrText xml:space="preserve"> PAGEREF _Toc225985176 \h </w:instrText>
         </w:r>
         <w:r>
           <w:rPr>
@@ -2473,7 +2290,7 @@
             <w:noProof/>
             <w:webHidden/>
           </w:rPr>
-          <w:t>49</w:t>
+          <w:t>48</w:t>
         </w:r>
         <w:r>
           <w:rPr>
@@ -2494,7 +2311,7 @@
           <w:noProof/>
         </w:rPr>
       </w:pPr>
-      <w:hyperlink w:anchor="_Toc225879180" w:history="1">
+      <w:hyperlink w:anchor="_Toc225985177" w:history="1">
         <w:r>
           <w:rPr>
             <w:rStyle w:val="Hyperlink"/>
@@ -2522,7 +2339,7 @@
             <w:noProof/>
             <w:webHidden/>
           </w:rPr>
-          <w:instrText xml:space="preserve"> PAGEREF _Toc225879180 \h </w:instrText>
+          <w:instrText xml:space="preserve"> PAGEREF _Toc225985177 \h </w:instrText>
         </w:r>
         <w:r>
           <w:rPr>
@@ -2542,7 +2359,7 @@
             <w:noProof/>
             <w:webHidden/>
           </w:rPr>
-          <w:t>49</w:t>
+          <w:t>48</w:t>
         </w:r>
         <w:r>
           <w:rPr>
@@ -2563,7 +2380,7 @@
           <w:noProof/>
         </w:rPr>
       </w:pPr>
-      <w:hyperlink w:anchor="_Toc225879181" w:history="1">
+      <w:hyperlink w:anchor="_Toc225985178" w:history="1">
         <w:r>
           <w:rPr>
             <w:rStyle w:val="Hyperlink"/>
@@ -2591,7 +2408,76 @@
             <w:noProof/>
             <w:webHidden/>
           </w:rPr>
-          <w:instrText xml:space="preserve"> PAGEREF _Toc225879181 \h </w:instrText>
+          <w:instrText xml:space="preserve"> PAGEREF _Toc225985178 \h </w:instrText>
+        </w:r>
+        <w:r>
+          <w:rPr>
+            <w:noProof/>
+            <w:webHidden/>
+          </w:rPr>
+        </w:r>
+        <w:r>
+          <w:rPr>
+            <w:noProof/>
+            <w:webHidden/>
+          </w:rPr>
+          <w:fldChar w:fldCharType="separate"/>
+        </w:r>
+        <w:r>
+          <w:rPr>
+            <w:noProof/>
+            <w:webHidden/>
+          </w:rPr>
+          <w:t>50</w:t>
+        </w:r>
+        <w:r>
+          <w:rPr>
+            <w:noProof/>
+            <w:webHidden/>
+          </w:rPr>
+          <w:fldChar w:fldCharType="end"/>
+        </w:r>
+      </w:hyperlink>
+    </w:p>
+    <w:p>
+      <w:pPr>
+        <w:pStyle w:val="TOC2"/>
+        <w:tabs>
+          <w:tab w:val="right" w:leader="dot" w:pos="9016"/>
+        </w:tabs>
+        <w:rPr>
+          <w:noProof/>
+        </w:rPr>
+      </w:pPr>
+      <w:hyperlink w:anchor="_Toc225985179" w:history="1">
+        <w:r>
+          <w:rPr>
+            <w:rStyle w:val="Hyperlink"/>
+            <w:rFonts w:cs="Times New Roman"/>
+            <w:noProof/>
+          </w:rPr>
+          <w:t>4.4 Strengths of the Study</w:t>
+        </w:r>
+        <w:r>
+          <w:rPr>
+            <w:noProof/>
+            <w:webHidden/>
+          </w:rPr>
+          <w:tab/>
+        </w:r>
+        <w:r>
+          <w:rPr>
+            <w:noProof/>
+            <w:webHidden/>
+          </w:rPr>
+          <w:fldChar w:fldCharType="begin"/>
+        </w:r>
+        <w:r>
+          <w:rPr>
+            <w:noProof/>
+            <w:webHidden/>
+          </w:rPr>
+          <w:instrText xml:space="preserve"> PAGEREF _Toc225985179 \h </w:instrText>
         </w:r>
         <w:r>
           <w:rPr>
@@ -2632,14 +2518,14 @@
           <w:noProof/>
         </w:rPr>
       </w:pPr>
-      <w:hyperlink w:anchor="_Toc225879182" w:history="1">
+      <w:hyperlink w:anchor="_Toc225985180" w:history="1">
         <w:r>
           <w:rPr>
             <w:rStyle w:val="Hyperlink"/>
             <w:rFonts w:cs="Times New Roman"/>
             <w:noProof/>
           </w:rPr>
-          <w:t>4.4 Strengths of the Study</w:t>
+          <w:t>4.5 Limitations</w:t>
         </w:r>
         <w:r>
           <w:rPr>
@@ -2660,7 +2546,76 @@
             <w:noProof/>
             <w:webHidden/>
           </w:rPr>
-          <w:instrText xml:space="preserve"> PAGEREF _Toc225879182 \h </w:instrText>
+          <w:instrText xml:space="preserve"> PAGEREF _Toc225985180 \h </w:instrText>
+        </w:r>
+        <w:r>
+          <w:rPr>
+            <w:noProof/>
+            <w:webHidden/>
+          </w:rPr>
+        </w:r>
+        <w:r>
+          <w:rPr>
+            <w:noProof/>
+            <w:webHidden/>
+          </w:rPr>
+          <w:fldChar w:fldCharType="separate"/>
+        </w:r>
+        <w:r>
+          <w:rPr>
+            <w:noProof/>
+            <w:webHidden/>
+          </w:rPr>
+          <w:t>51</w:t>
+        </w:r>
+        <w:r>
+          <w:rPr>
+            <w:noProof/>
+            <w:webHidden/>
+          </w:rPr>
+          <w:fldChar w:fldCharType="end"/>
+        </w:r>
+      </w:hyperlink>
+    </w:p>
+    <w:p>
+      <w:pPr>
+        <w:pStyle w:val="TOC2"/>
+        <w:tabs>
+          <w:tab w:val="right" w:leader="dot" w:pos="9016"/>
+        </w:tabs>
+        <w:rPr>
+          <w:noProof/>
+        </w:rPr>
+      </w:pPr>
+      <w:hyperlink w:anchor="_Toc225985181" w:history="1">
+        <w:r>
+          <w:rPr>
+            <w:rStyle w:val="Hyperlink"/>
+            <w:rFonts w:cs="Times New Roman"/>
+            <w:noProof/>
+          </w:rPr>
+          <w:t>4.6 Recommendations for Future Research</w:t>
+        </w:r>
+        <w:r>
+          <w:rPr>
+            <w:noProof/>
+            <w:webHidden/>
+          </w:rPr>
+          <w:tab/>
+        </w:r>
+        <w:r>
+          <w:rPr>
+            <w:noProof/>
+            <w:webHidden/>
+          </w:rPr>
+          <w:fldChar w:fldCharType="begin"/>
+        </w:r>
+        <w:r>
+          <w:rPr>
+            <w:noProof/>
+            <w:webHidden/>
+          </w:rPr>
+          <w:instrText xml:space="preserve"> PAGEREF _Toc225985181 \h </w:instrText>
         </w:r>
         <w:r>
           <w:rPr>
@@ -2693,144 +2648,6 @@
     </w:p>
     <w:p>
       <w:pPr>
-        <w:pStyle w:val="TOC2"/>
-        <w:tabs>
-          <w:tab w:val="right" w:leader="dot" w:pos="9016"/>
-        </w:tabs>
-        <w:rPr>
-          <w:noProof/>
-        </w:rPr>
-      </w:pPr>
-      <w:hyperlink w:anchor="_Toc225879183" w:history="1">
-        <w:r>
-          <w:rPr>
-            <w:rStyle w:val="Hyperlink"/>
-            <w:rFonts w:cs="Times New Roman"/>
-            <w:noProof/>
-          </w:rPr>
-          <w:t>4.5 Limitations</w:t>
-        </w:r>
-        <w:r>
-          <w:rPr>
-            <w:noProof/>
-            <w:webHidden/>
-          </w:rPr>
-          <w:tab/>
-        </w:r>
-        <w:r>
-          <w:rPr>
-            <w:noProof/>
-            <w:webHidden/>
-          </w:rPr>
-          <w:fldChar w:fldCharType="begin"/>
-        </w:r>
-        <w:r>
-          <w:rPr>
-            <w:noProof/>
-            <w:webHidden/>
-          </w:rPr>
-          <w:instrText xml:space="preserve"> PAGEREF _Toc225879183 \h </w:instrText>
-        </w:r>
-        <w:r>
-          <w:rPr>
-            <w:noProof/>
-            <w:webHidden/>
-          </w:rPr>
-        </w:r>
-        <w:r>
-          <w:rPr>
-            <w:noProof/>
-            <w:webHidden/>
-          </w:rPr>
-          <w:fldChar w:fldCharType="separate"/>
-        </w:r>
-        <w:r>
-          <w:rPr>
-            <w:noProof/>
-            <w:webHidden/>
-          </w:rPr>
-          <w:t>52</w:t>
-        </w:r>
-        <w:r>
-          <w:rPr>
-            <w:noProof/>
-            <w:webHidden/>
-          </w:rPr>
-          <w:fldChar w:fldCharType="end"/>
-        </w:r>
-      </w:hyperlink>
-    </w:p>
-    <w:p>
-      <w:pPr>
-        <w:pStyle w:val="TOC2"/>
-        <w:tabs>
-          <w:tab w:val="right" w:leader="dot" w:pos="9016"/>
-        </w:tabs>
-        <w:rPr>
-          <w:noProof/>
-        </w:rPr>
-      </w:pPr>
-      <w:hyperlink w:anchor="_Toc225879184" w:history="1">
-        <w:r>
-          <w:rPr>
-            <w:rStyle w:val="Hyperlink"/>
-            <w:rFonts w:cs="Times New Roman"/>
-            <w:noProof/>
-          </w:rPr>
-          <w:t>4.6 Recommendations for Future Research</w:t>
-        </w:r>
-        <w:r>
-          <w:rPr>
-            <w:noProof/>
-            <w:webHidden/>
-          </w:rPr>
-          <w:tab/>
-        </w:r>
-        <w:r>
-          <w:rPr>
-            <w:noProof/>
-            <w:webHidden/>
-          </w:rPr>
-          <w:fldChar w:fldCharType="begin"/>
-        </w:r>
-        <w:r>
-          <w:rPr>
-            <w:noProof/>
-            <w:webHidden/>
-          </w:rPr>
-          <w:instrText xml:space="preserve"> PAGEREF _Toc225879184 \h </w:instrText>
-        </w:r>
-        <w:r>
-          <w:rPr>
-            <w:noProof/>
-            <w:webHidden/>
-          </w:rPr>
-        </w:r>
-        <w:r>
-          <w:rPr>
-            <w:noProof/>
-            <w:webHidden/>
-          </w:rPr>
-          <w:fldChar w:fldCharType="separate"/>
-        </w:r>
-        <w:r>
-          <w:rPr>
-            <w:noProof/>
-            <w:webHidden/>
-          </w:rPr>
-          <w:t>53</w:t>
-        </w:r>
-        <w:r>
-          <w:rPr>
-            <w:noProof/>
-            <w:webHidden/>
-          </w:rPr>
-          <w:fldChar w:fldCharType="end"/>
-        </w:r>
-      </w:hyperlink>
-    </w:p>
-    <w:p>
-      <w:pPr>
         <w:pStyle w:val="TOC1"/>
         <w:tabs>
           <w:tab w:val="right" w:leader="dot" w:pos="9016"/>
@@ -2839,7 +2656,7 @@
           <w:noProof/>
         </w:rPr>
       </w:pPr>
-      <w:hyperlink w:anchor="_Toc225879185" w:history="1">
+      <w:hyperlink w:anchor="_Toc225985182" w:history="1">
         <w:r>
           <w:rPr>
             <w:rStyle w:val="Hyperlink"/>
@@ -2867,7 +2684,76 @@
             <w:noProof/>
             <w:webHidden/>
           </w:rPr>
-          <w:instrText xml:space="preserve"> PAGEREF _Toc225879185 \h </w:instrText>
+          <w:instrText xml:space="preserve"> PAGEREF _Toc225985182 \h </w:instrText>
+        </w:r>
+        <w:r>
+          <w:rPr>
+            <w:noProof/>
+            <w:webHidden/>
+          </w:rPr>
+        </w:r>
+        <w:r>
+          <w:rPr>
+            <w:noProof/>
+            <w:webHidden/>
+          </w:rPr>
+          <w:fldChar w:fldCharType="separate"/>
+        </w:r>
+        <w:r>
+          <w:rPr>
+            <w:noProof/>
+            <w:webHidden/>
+          </w:rPr>
+          <w:t>54</w:t>
+        </w:r>
+        <w:r>
+          <w:rPr>
+            <w:noProof/>
+            <w:webHidden/>
+          </w:rPr>
+          <w:fldChar w:fldCharType="end"/>
+        </w:r>
+      </w:hyperlink>
+    </w:p>
+    <w:p>
+      <w:pPr>
+        <w:pStyle w:val="TOC1"/>
+        <w:tabs>
+          <w:tab w:val="right" w:leader="dot" w:pos="9016"/>
+        </w:tabs>
+        <w:rPr>
+          <w:noProof/>
+        </w:rPr>
+      </w:pPr>
+      <w:hyperlink w:anchor="_Toc225985183" w:history="1">
+        <w:r>
+          <w:rPr>
+            <w:rStyle w:val="Hyperlink"/>
+            <w:rFonts w:cs="Times New Roman"/>
+            <w:noProof/>
+          </w:rPr>
+          <w:t>RECOMMENDATIONS</w:t>
+        </w:r>
+        <w:r>
+          <w:rPr>
+            <w:noProof/>
+            <w:webHidden/>
+          </w:rPr>
+          <w:tab/>
+        </w:r>
+        <w:r>
+          <w:rPr>
+            <w:noProof/>
+            <w:webHidden/>
+          </w:rPr>
+          <w:fldChar w:fldCharType="begin"/>
+        </w:r>
+        <w:r>
+          <w:rPr>
+            <w:noProof/>
+            <w:webHidden/>
+          </w:rPr>
+          <w:instrText xml:space="preserve"> PAGEREF _Toc225985183 \h </w:instrText>
         </w:r>
         <w:r>
           <w:rPr>
@@ -2908,14 +2794,13 @@
           <w:noProof/>
         </w:rPr>
       </w:pPr>
-      <w:hyperlink w:anchor="_Toc225879186" w:history="1">
+      <w:hyperlink w:anchor="_Toc225985184" w:history="1">
         <w:r>
           <w:rPr>
             <w:rStyle w:val="Hyperlink"/>
-            <w:rFonts w:cs="Times New Roman"/>
             <w:noProof/>
           </w:rPr>
-          <w:t>RECOMMENDATIONS</w:t>
+          <w:t>REFERENCES</w:t>
         </w:r>
         <w:r>
           <w:rPr>
@@ -2936,7 +2821,7 @@
             <w:noProof/>
             <w:webHidden/>
           </w:rPr>
-          <w:instrText xml:space="preserve"> PAGEREF _Toc225879186 \h </w:instrText>
+          <w:instrText xml:space="preserve"> PAGEREF _Toc225985184 \h </w:instrText>
         </w:r>
         <w:r>
           <w:rPr>
@@ -2977,75 +2862,7 @@
           <w:noProof/>
         </w:rPr>
       </w:pPr>
-      <w:hyperlink w:anchor="_Toc225879187" w:history="1">
-        <w:r>
-          <w:rPr>
-            <w:rStyle w:val="Hyperlink"/>
-            <w:noProof/>
-          </w:rPr>
-          <w:t>REFERENCES</w:t>
-        </w:r>
-        <w:r>
-          <w:rPr>
-            <w:noProof/>
-            <w:webHidden/>
-          </w:rPr>
-          <w:tab/>
-        </w:r>
-        <w:r>
-          <w:rPr>
-            <w:noProof/>
-            <w:webHidden/>
-          </w:rPr>
-          <w:fldChar w:fldCharType="begin"/>
-        </w:r>
-        <w:r>
-          <w:rPr>
-            <w:noProof/>
-            <w:webHidden/>
-          </w:rPr>
-          <w:instrText xml:space="preserve"> PAGEREF _Toc225879187 \h </w:instrText>
-        </w:r>
-        <w:r>
-          <w:rPr>
-            <w:noProof/>
-            <w:webHidden/>
-          </w:rPr>
-        </w:r>
-        <w:r>
-          <w:rPr>
-            <w:noProof/>
-            <w:webHidden/>
-          </w:rPr>
-          <w:fldChar w:fldCharType="separate"/>
-        </w:r>
-        <w:r>
-          <w:rPr>
-            <w:noProof/>
-            <w:webHidden/>
-          </w:rPr>
-          <w:t>57</w:t>
-        </w:r>
-        <w:r>
-          <w:rPr>
-            <w:noProof/>
-            <w:webHidden/>
-          </w:rPr>
-          <w:fldChar w:fldCharType="end"/>
-        </w:r>
-      </w:hyperlink>
-    </w:p>
-    <w:p>
-      <w:pPr>
-        <w:pStyle w:val="TOC1"/>
-        <w:tabs>
-          <w:tab w:val="right" w:leader="dot" w:pos="9016"/>
-        </w:tabs>
-        <w:rPr>
-          <w:noProof/>
-        </w:rPr>
-      </w:pPr>
-      <w:hyperlink w:anchor="_Toc225879188" w:history="1">
+      <w:hyperlink w:anchor="_Toc225985185" w:history="1">
         <w:r>
           <w:rPr>
             <w:rStyle w:val="Hyperlink"/>
@@ -3072,7 +2889,7 @@
             <w:noProof/>
             <w:webHidden/>
           </w:rPr>
-          <w:instrText xml:space="preserve"> PAGEREF _Toc225879188 \h </w:instrText>
+          <w:instrText xml:space="preserve"> PAGEREF _Toc225985185 \h </w:instrText>
         </w:r>
         <w:r>
           <w:rPr>
@@ -3092,7 +2909,7 @@
             <w:noProof/>
             <w:webHidden/>
           </w:rPr>
-          <w:t>63</w:t>
+          <w:t>62</w:t>
         </w:r>
         <w:r>
           <w:rPr>
@@ -3124,6 +2941,183 @@
           <w:sz w:val="28"/>
         </w:rPr>
         <w:lastRenderedPageBreak/>
+        <w:t>ABSTRACT</w:t>
+      </w:r>
+    </w:p>
+    <w:p>
+      <w:pPr>
+        <w:jc w:val="center"/>
+      </w:pPr>
+      <w:r>
+        <w:rPr>
+          <w:b/>
+        </w:rPr>
+        <w:t>QUALITY OF PHYSICAL ACTIVITY INFORMATION ON TRADITIONAL WEBSITES VERSUS SOCIAL MEDIA PLATFORMS: A CROSS-SECTIONAL CONTENT ANALYSIS USING DISCERN AND JAMA BENCHMARKS</w:t>
+      </w:r>
+    </w:p>
+    <w:p>
+      <w:pPr>
+        <w:jc w:val="center"/>
+      </w:pPr>
+      <w:r>
+        <w:rPr>
+          <w:i/>
+        </w:rPr>
+        <w:t>FIZINIO AKTYVUMO INFORMACIJOS KOKYBĖ TRADICINĖSE INTERNETO SVETAINĖSE IR SOCIALINIŲ TINKLŲ PLATFORMOSE: SKERSPJŪVIO TURINIO ANALIZĖ TAIKANT DISCERN IR JAMA KRITERIJUS</w:t>
+      </w:r>
+    </w:p>
+    <w:p>
+      <w:pPr>
+        <w:spacing w:after="240"/>
+        <w:jc w:val="left"/>
+      </w:pPr>
+      <w:r>
+        <w:rPr>
+          <w:i/>
+        </w:rPr>
+        <w:t>Keywords: physical activity; health information quality; social media; DISCERN; JAMA benchmarks</w:t>
+      </w:r>
+    </w:p>
+    <w:p>
+      <w:pPr>
+        <w:ind w:firstLine="709"/>
+      </w:pPr>
+      <w:r>
+        <w:t xml:space="preserve">Problem. The public increasingly relies on websites and social media for physical activity advice, yet evidence comparing the quality of information across these environments remains limited. Aim. To compare the quality of physical activity information on traditional websites, YouTube, TikTok, and Instagram using DISCERN and JAMA benchmarks. Objectives. To examine platform differences, creator-type differences, and associations between engagement metrics and quality. Hypothesis. Website content and content </w:t>
+      </w:r>
+      <w:r>
+        <w:t>produced by healthcare or certified fitness professionals would score higher than short-form social media content, whereas engagement metrics would not reliably indicate quality. Methods. A cross-sectional content analysis was conducted on 197 publicly accessible English-language items retrieved with five standardized search terms. Information quality was assessed with the 16-item DISCERN instrument and four JAMA criteria. Inter-rater reliability was evaluated on 40 items. Kruskal-Wallis, Mann-Whitney U, ch</w:t>
+      </w:r>
+      <w:r>
+        <w:t>i-square, and Spearman analyses were used. Main findings. Quality differed significantly by platform: websites ranked highest, followed by YouTube, TikTok, and Instagram. JAMA compliance was low across all platforms. Creator type was associated with DISCERN scores, with healthcare and certified fitness professionals performing better than general users. On YouTube, higher views and likes were associated with lower quality. Conclusions. Traditional websites remain the most reliable source of physical activit</w:t>
+      </w:r>
+      <w:r>
+        <w:t>y information, whereas short-form social media content is more vulnerable to low quality and weak transparency.</w:t>
+      </w:r>
+    </w:p>
+    <w:p>
+      <w:r>
+        <w:br w:type="page"/>
+      </w:r>
+    </w:p>
+    <w:p>
+      <w:pPr>
+        <w:spacing w:after="240"/>
+        <w:jc w:val="center"/>
+      </w:pPr>
+      <w:r>
+        <w:rPr>
+          <w:b/>
+          <w:sz w:val="28"/>
+        </w:rPr>
+        <w:lastRenderedPageBreak/>
+        <w:t>SANTRAUKA</w:t>
+      </w:r>
+    </w:p>
+    <w:p>
+      <w:pPr>
+        <w:jc w:val="center"/>
+      </w:pPr>
+      <w:r>
+        <w:rPr>
+          <w:b/>
+        </w:rPr>
+        <w:t>FIZINIO AKTYVUMO INFORMACIJOS KOKYBĖ TRADICINĖSE INTERNETO SVETAINĖSE IR SOCIALINIŲ TINKLŲ PLATFORMOSE: SKERSPJŪVIO TURINIO ANALIZĖ TAIKANT DISCERN IR JAMA KRITERIJUS</w:t>
+      </w:r>
+    </w:p>
+    <w:p>
+      <w:pPr>
+        <w:jc w:val="center"/>
+      </w:pPr>
+      <w:r>
+        <w:rPr>
+          <w:i/>
+        </w:rPr>
+        <w:t>QUALITY OF PHYSICAL ACTIVITY INFORMATION ON TRADITIONAL WEBSITES VERSUS SOCIAL MEDIA PLATFORMS: A CROSS-SECTIONAL CONTENT ANALYSIS USING DISCERN AND JAMA BENCHMARKS</w:t>
+      </w:r>
+    </w:p>
+    <w:p>
+      <w:pPr>
+        <w:spacing w:after="240"/>
+        <w:jc w:val="left"/>
+      </w:pPr>
+      <w:r>
+        <w:rPr>
+          <w:i/>
+        </w:rPr>
+        <w:t>Raktiniai žodžiai: fizinis aktyvumas; sveikatos informacijos kokybė; socialiniai tinklai; DISCERN; JAMA kriterijai</w:t>
+      </w:r>
+    </w:p>
+    <w:p>
+      <w:pPr>
+        <w:ind w:firstLine="709"/>
+      </w:pPr>
+      <w:r>
+        <w:t>Problema. Visuomenė vis dažniau fizinio aktyvumo informacijos ieško interneto svetainėse ir socialiniuose tinkluose, tačiau lyginamųjų duomenų apie informacijos kokybę skirtingose skaitmeninėse aplinkose vis dar trūksta. Tikslas. Palyginti fizinio aktyvumo informacijos kokybę tradicinėse interneto svetainėse, YouTube, TikTok ir Instagram, taikant DISCERN instrumentą ir JAMA kriterijus. Uždaviniai. Įvertinti platformų skirtumus, kūrėjų tipų skirtumus ir ryšį tarp įsitraukimo rodiklių bei informacijos kokybės</w:t>
+      </w:r>
+      <w:r>
+        <w:t>. Hipotezė. Manyta, kad tradicinių interneto svetainių turinys ir sveikatos priežiūros ar sertifikuotų fitneso specialistų sukurtas turinys bus aukštesnės kokybės nei trumpo formato socialinių tinklų turinys, o įsitraukimo rodikliai patikimai neatspindės kokybės. Metodai. Atlikta 197 viešai prieinamų anglų kalba paskelbtų vienetų skerspjūvio turinio analizė, naudojant penkias standartizuotas paieškos frazes. Informacijos kokybė vertinta 16 klausimų DISCERN instrumentu ir keturiais JAMA kriterijais. Tarpvert</w:t>
+      </w:r>
+      <w:r>
+        <w:t>intojų patikimumas vertintas 40 vienetų imtyje. Taikyti Kruskal-Wallis, Mann-Whitney U, chi kvadrato ir Spearman koreliacijos testai. Pagrindiniai rezultatai. Informacijos kokybė statistiškai reikšmingai skyrėsi tarp platformų: aukščiausius rodiklius pasiekė interneto svetainės, po jų sekė YouTube, TikTok ir Instagram. JAMA kriterijų atitikimas visose platformose buvo žemas. Kūrėjo tipas buvo susijęs su DISCERN įverčiais: geriau pasirodė sveikatos priežiūros ir sertifikuoti fizinio aktyvumo specialistai nei</w:t>
+      </w:r>
+      <w:r>
+        <w:t xml:space="preserve"> bendrieji naudotojai. YouTube platformoje didesnis peržiūrų ir patiktukų skaičius buvo susijęs su prastesne kokybe. Išvados. Tradicinės interneto svetainės išlieka patikimiausiu fizinio aktyvumo informacijos šaltiniu, o trumpo formato socialinių tinklų turinys dažniau pasižymi prastesne kokybe ir mažesniu skaidrumu.</w:t>
+      </w:r>
+    </w:p>
+    <w:p>
+      <w:r>
+        <w:br w:type="page"/>
+      </w:r>
+    </w:p>
+    <w:p>
+      <w:pPr>
+        <w:spacing w:after="240"/>
+        <w:jc w:val="center"/>
+      </w:pPr>
+      <w:r>
+        <w:rPr>
+          <w:b/>
+          <w:sz w:val="28"/>
+        </w:rPr>
+        <w:lastRenderedPageBreak/>
+        <w:t>ACKNOWLEDGMENTS</w:t>
+      </w:r>
+    </w:p>
+    <w:p>
+      <w:pPr>
+        <w:ind w:firstLine="709"/>
+      </w:pPr>
+      <w:r>
+        <w:t>I would like to express my sincere gratitude to my supervisor, Dr. Antanas Usas, for his guidance, expertise, and constructive feedback throughout this research project.</w:t>
+      </w:r>
+    </w:p>
+    <w:p>
+      <w:pPr>
+        <w:ind w:firstLine="709"/>
+      </w:pPr>
+      <w:r>
+        <w:t>I am grateful to the faculty and staff of the Master of Public Health programme at Lithuanian Sports University for providing the academic environment and resources necessary to complete this thesis.</w:t>
+      </w:r>
+    </w:p>
+    <w:p>
+      <w:pPr>
+        <w:ind w:firstLine="709"/>
+      </w:pPr>
+      <w:r>
+        <w:t>I also thank my family and friends for their patience and support during the course of my studies.</w:t>
+      </w:r>
+    </w:p>
+    <w:p>
+      <w:pPr>
+        <w:spacing w:after="240"/>
+        <w:jc w:val="center"/>
+      </w:pPr>
+      <w:r>
+        <w:rPr>
+          <w:b/>
+          <w:sz w:val="28"/>
+        </w:rPr>
         <w:t>LIST OF ABBREVIATIONS</w:t>
       </w:r>
     </w:p>
@@ -3483,7 +3477,7 @@
       <w:pPr>
         <w:pStyle w:val="Heading1"/>
       </w:pPr>
-      <w:bookmarkStart w:id="0" w:name="_Toc225879152"/>
+      <w:bookmarkStart w:id="0" w:name="_Toc225985149"/>
       <w:r>
         <w:rPr>
           <w:rFonts w:ascii="Times New Roman" w:hAnsi="Times New Roman"/>
@@ -3543,7 +3537,7 @@
       <w:pPr>
         <w:pStyle w:val="Heading1"/>
       </w:pPr>
-      <w:bookmarkStart w:id="1" w:name="_Toc225879153"/>
+      <w:bookmarkStart w:id="1" w:name="_Toc225985150"/>
       <w:r>
         <w:rPr>
           <w:rFonts w:ascii="Times New Roman" w:hAnsi="Times New Roman"/>
@@ -3558,7 +3552,7 @@
       <w:pPr>
         <w:pStyle w:val="Heading2"/>
       </w:pPr>
-      <w:bookmarkStart w:id="2" w:name="_Toc225879154"/>
+      <w:bookmarkStart w:id="2" w:name="_Toc225985151"/>
       <w:r>
         <w:rPr>
           <w:rFonts w:ascii="Times New Roman" w:hAnsi="Times New Roman"/>
@@ -3621,7 +3615,7 @@
       <w:pPr>
         <w:pStyle w:val="Heading2"/>
       </w:pPr>
-      <w:bookmarkStart w:id="3" w:name="_Toc225879155"/>
+      <w:bookmarkStart w:id="3" w:name="_Toc225985152"/>
       <w:r>
         <w:rPr>
           <w:rFonts w:ascii="Times New Roman" w:hAnsi="Times New Roman"/>
@@ -3691,7 +3685,7 @@
       <w:pPr>
         <w:pStyle w:val="Heading2"/>
       </w:pPr>
-      <w:bookmarkStart w:id="4" w:name="_Toc225879156"/>
+      <w:bookmarkStart w:id="4" w:name="_Toc225985153"/>
       <w:r>
         <w:rPr>
           <w:rFonts w:ascii="Times New Roman" w:hAnsi="Times New Roman"/>
@@ -3732,7 +3726,7 @@
       <w:pPr>
         <w:pStyle w:val="Heading2"/>
       </w:pPr>
-      <w:bookmarkStart w:id="5" w:name="_Toc225879157"/>
+      <w:bookmarkStart w:id="5" w:name="_Toc225985154"/>
       <w:r>
         <w:rPr>
           <w:rFonts w:ascii="Times New Roman" w:hAnsi="Times New Roman"/>
@@ -3792,7 +3786,7 @@
       <w:pPr>
         <w:pStyle w:val="Heading2"/>
       </w:pPr>
-      <w:bookmarkStart w:id="6" w:name="_Toc225879158"/>
+      <w:bookmarkStart w:id="6" w:name="_Toc225985155"/>
       <w:r>
         <w:rPr>
           <w:rFonts w:ascii="Times New Roman" w:hAnsi="Times New Roman"/>
@@ -3856,7 +3850,7 @@
       <w:pPr>
         <w:pStyle w:val="Heading2"/>
       </w:pPr>
-      <w:bookmarkStart w:id="7" w:name="_Toc225879159"/>
+      <w:bookmarkStart w:id="7" w:name="_Toc225985156"/>
       <w:r>
         <w:rPr>
           <w:rFonts w:ascii="Times New Roman" w:hAnsi="Times New Roman"/>
@@ -3913,7 +3907,7 @@
       <w:pPr>
         <w:pStyle w:val="Heading2"/>
       </w:pPr>
-      <w:bookmarkStart w:id="8" w:name="_Toc225879160"/>
+      <w:bookmarkStart w:id="8" w:name="_Toc225985157"/>
       <w:r>
         <w:rPr>
           <w:rFonts w:ascii="Times New Roman" w:hAnsi="Times New Roman"/>
@@ -3994,7 +3988,7 @@
         <w:spacing w:before="0" w:after="240"/>
         <w:jc w:val="center"/>
       </w:pPr>
-      <w:bookmarkStart w:id="9" w:name="_Toc225879161"/>
+      <w:bookmarkStart w:id="9" w:name="_Toc225985158"/>
       <w:r>
         <w:rPr>
           <w:rFonts w:ascii="Times New Roman" w:hAnsi="Times New Roman" w:cs="Times New Roman"/>
@@ -4027,7 +4021,7 @@
         <w:pStyle w:val="Heading2"/>
         <w:jc w:val="left"/>
       </w:pPr>
-      <w:bookmarkStart w:id="10" w:name="_Toc225879162"/>
+      <w:bookmarkStart w:id="10" w:name="_Toc225985159"/>
       <w:r>
         <w:rPr>
           <w:rFonts w:ascii="Times New Roman" w:hAnsi="Times New Roman" w:cs="Times New Roman"/>
@@ -4077,7 +4071,7 @@
         <w:pStyle w:val="Heading2"/>
         <w:jc w:val="left"/>
       </w:pPr>
-      <w:bookmarkStart w:id="11" w:name="_Toc225879163"/>
+      <w:bookmarkStart w:id="11" w:name="_Toc225985160"/>
       <w:r>
         <w:rPr>
           <w:rFonts w:ascii="Times New Roman" w:hAnsi="Times New Roman" w:cs="Times New Roman"/>
@@ -4253,7 +4247,7 @@
         <w:pStyle w:val="Heading2"/>
         <w:jc w:val="left"/>
       </w:pPr>
-      <w:bookmarkStart w:id="12" w:name="_Toc225879164"/>
+      <w:bookmarkStart w:id="12" w:name="_Toc225985161"/>
       <w:r>
         <w:rPr>
           <w:rFonts w:ascii="Times New Roman" w:hAnsi="Times New Roman" w:cs="Times New Roman"/>
@@ -4304,7 +4298,7 @@
         <w:pStyle w:val="Heading2"/>
         <w:jc w:val="left"/>
       </w:pPr>
-      <w:bookmarkStart w:id="13" w:name="_Toc225879165"/>
+      <w:bookmarkStart w:id="13" w:name="_Toc225985162"/>
       <w:r>
         <w:rPr>
           <w:rFonts w:ascii="Times New Roman" w:hAnsi="Times New Roman" w:cs="Times New Roman"/>
@@ -5477,7 +5471,7 @@
         <w:pStyle w:val="Heading2"/>
         <w:jc w:val="left"/>
       </w:pPr>
-      <w:bookmarkStart w:id="14" w:name="_Toc225879166"/>
+      <w:bookmarkStart w:id="14" w:name="_Toc225985163"/>
       <w:r>
         <w:rPr>
           <w:rFonts w:ascii="Times New Roman" w:hAnsi="Times New Roman" w:cs="Times New Roman"/>
@@ -7272,7 +7266,7 @@
         <w:pStyle w:val="Heading2"/>
         <w:jc w:val="left"/>
       </w:pPr>
-      <w:bookmarkStart w:id="15" w:name="_Toc225879167"/>
+      <w:bookmarkStart w:id="15" w:name="_Toc225985164"/>
       <w:r>
         <w:rPr>
           <w:rFonts w:ascii="Times New Roman" w:hAnsi="Times New Roman" w:cs="Times New Roman"/>
@@ -7954,7 +7948,7 @@
         <w:pStyle w:val="Heading2"/>
         <w:jc w:val="left"/>
       </w:pPr>
-      <w:bookmarkStart w:id="16" w:name="_Toc225879168"/>
+      <w:bookmarkStart w:id="16" w:name="_Toc225985165"/>
       <w:r>
         <w:rPr>
           <w:rFonts w:ascii="Times New Roman" w:hAnsi="Times New Roman" w:cs="Times New Roman"/>
@@ -8803,7 +8797,7 @@
         <w:pStyle w:val="Heading1"/>
         <w:spacing w:before="0" w:after="240"/>
       </w:pPr>
-      <w:bookmarkStart w:id="17" w:name="_Toc225879169"/>
+      <w:bookmarkStart w:id="17" w:name="_Toc225985166"/>
       <w:r>
         <w:rPr>
           <w:rFonts w:ascii="Times New Roman" w:hAnsi="Times New Roman" w:cs="Times New Roman"/>
@@ -8818,7 +8812,7 @@
         <w:pStyle w:val="Heading2"/>
         <w:spacing w:before="0" w:after="200"/>
       </w:pPr>
-      <w:bookmarkStart w:id="18" w:name="_Toc225879170"/>
+      <w:bookmarkStart w:id="18" w:name="_Toc225985167"/>
       <w:r>
         <w:rPr>
           <w:rFonts w:ascii="Times New Roman" w:hAnsi="Times New Roman" w:cs="Times New Roman"/>
@@ -10054,7 +10048,7 @@
         <w:pStyle w:val="Heading2"/>
         <w:spacing w:before="0" w:after="200"/>
       </w:pPr>
-      <w:bookmarkStart w:id="19" w:name="_Toc225879171"/>
+      <w:bookmarkStart w:id="19" w:name="_Toc225985168"/>
       <w:r>
         <w:rPr>
           <w:rFonts w:ascii="Times New Roman" w:hAnsi="Times New Roman" w:cs="Times New Roman"/>
@@ -10097,7 +10091,7 @@
         <w:pStyle w:val="Heading2"/>
         <w:spacing w:before="0" w:after="200"/>
       </w:pPr>
-      <w:bookmarkStart w:id="20" w:name="_Toc225879172"/>
+      <w:bookmarkStart w:id="20" w:name="_Toc225985169"/>
       <w:r>
         <w:rPr>
           <w:rFonts w:ascii="Times New Roman" w:hAnsi="Times New Roman" w:cs="Times New Roman"/>
@@ -11206,7 +11200,7 @@
           <w:noProof/>
         </w:rPr>
         <w:drawing>
-          <wp:inline distT="0" distB="0" distL="0" distR="0" wp14:anchorId="4F81D787" wp14:editId="4336404B">
+          <wp:inline distT="0" distB="0" distL="0" distR="0" wp14:anchorId="2B03FFA9" wp14:editId="5373BFC0">
             <wp:extent cx="5029200" cy="3857584"/>
             <wp:effectExtent l="0" t="0" r="0" b="0"/>
             <wp:docPr id="1" name="Picture 1"/>
@@ -11295,7 +11289,7 @@
           <w:noProof/>
         </w:rPr>
         <w:drawing>
-          <wp:inline distT="0" distB="0" distL="0" distR="0" wp14:anchorId="134D4674" wp14:editId="16949561">
+          <wp:inline distT="0" distB="0" distL="0" distR="0" wp14:anchorId="1A8FFBEC" wp14:editId="20C0580A">
             <wp:extent cx="5029200" cy="3131166"/>
             <wp:effectExtent l="0" t="0" r="0" b="0"/>
             <wp:docPr id="2" name="Picture 2"/>
@@ -11361,7 +11355,7 @@
         <w:pStyle w:val="Heading2"/>
         <w:spacing w:before="0" w:after="200"/>
       </w:pPr>
-      <w:bookmarkStart w:id="21" w:name="_Toc225879173"/>
+      <w:bookmarkStart w:id="21" w:name="_Toc225985170"/>
       <w:r>
         <w:rPr>
           <w:rFonts w:ascii="Times New Roman" w:hAnsi="Times New Roman" w:cs="Times New Roman"/>
@@ -12027,7 +12021,7 @@
         </w:rPr>
         <w:lastRenderedPageBreak/>
         <w:drawing>
-          <wp:inline distT="0" distB="0" distL="0" distR="0" wp14:anchorId="5D33576B" wp14:editId="15AD9205">
+          <wp:inline distT="0" distB="0" distL="0" distR="0" wp14:anchorId="0DFE402B" wp14:editId="6DF05E80">
             <wp:extent cx="5029200" cy="3573194"/>
             <wp:effectExtent l="0" t="0" r="0" b="0"/>
             <wp:docPr id="3" name="Picture 3"/>
@@ -12082,7 +12076,7 @@
         <w:pStyle w:val="Heading2"/>
         <w:spacing w:before="0" w:after="200"/>
       </w:pPr>
-      <w:bookmarkStart w:id="22" w:name="_Toc225879174"/>
+      <w:bookmarkStart w:id="22" w:name="_Toc225985171"/>
       <w:r>
         <w:rPr>
           <w:rFonts w:ascii="Times New Roman" w:hAnsi="Times New Roman" w:cs="Times New Roman"/>
@@ -12154,7 +12148,7 @@
           <w:noProof/>
         </w:rPr>
         <w:drawing>
-          <wp:inline distT="0" distB="0" distL="0" distR="0" wp14:anchorId="3EC77DBE" wp14:editId="062FB725">
+          <wp:inline distT="0" distB="0" distL="0" distR="0" wp14:anchorId="39664D23" wp14:editId="24A9FC47">
             <wp:extent cx="5029200" cy="3294582"/>
             <wp:effectExtent l="0" t="0" r="0" b="0"/>
             <wp:docPr id="4" name="Picture 4"/>
@@ -12209,7 +12203,7 @@
         <w:pStyle w:val="Heading2"/>
         <w:spacing w:before="0" w:after="200"/>
       </w:pPr>
-      <w:bookmarkStart w:id="23" w:name="_Toc225879175"/>
+      <w:bookmarkStart w:id="23" w:name="_Toc225985172"/>
       <w:r>
         <w:rPr>
           <w:rFonts w:ascii="Times New Roman" w:hAnsi="Times New Roman" w:cs="Times New Roman"/>
@@ -12286,7 +12280,7 @@
           <w:noProof/>
         </w:rPr>
         <w:drawing>
-          <wp:inline distT="0" distB="0" distL="0" distR="0" wp14:anchorId="6F91C71A" wp14:editId="46902748">
+          <wp:inline distT="0" distB="0" distL="0" distR="0" wp14:anchorId="283FEAFD" wp14:editId="3726B26B">
             <wp:extent cx="5029200" cy="3458844"/>
             <wp:effectExtent l="0" t="0" r="0" b="0"/>
             <wp:docPr id="5" name="Picture 5"/>
@@ -12341,7 +12335,7 @@
         <w:pStyle w:val="Heading2"/>
         <w:spacing w:before="0" w:after="200"/>
       </w:pPr>
-      <w:bookmarkStart w:id="24" w:name="_Toc225879176"/>
+      <w:bookmarkStart w:id="24" w:name="_Toc225985173"/>
       <w:r>
         <w:rPr>
           <w:rFonts w:ascii="Times New Roman" w:hAnsi="Times New Roman" w:cs="Times New Roman"/>
@@ -12385,7 +12379,7 @@
           <w:noProof/>
         </w:rPr>
         <w:drawing>
-          <wp:inline distT="0" distB="0" distL="0" distR="0" wp14:anchorId="233FD24B" wp14:editId="6273589E">
+          <wp:inline distT="0" distB="0" distL="0" distR="0" wp14:anchorId="629789C9" wp14:editId="6A8DD8D5">
             <wp:extent cx="5029200" cy="2317460"/>
             <wp:effectExtent l="0" t="0" r="0" b="0"/>
             <wp:docPr id="6" name="Picture 6"/>
@@ -12440,7 +12434,7 @@
         <w:pStyle w:val="Heading2"/>
         <w:spacing w:before="0" w:after="200"/>
       </w:pPr>
-      <w:bookmarkStart w:id="25" w:name="_Toc225879177"/>
+      <w:bookmarkStart w:id="25" w:name="_Toc225985174"/>
       <w:r>
         <w:rPr>
           <w:rFonts w:ascii="Times New Roman" w:hAnsi="Times New Roman" w:cs="Times New Roman"/>
@@ -12495,7 +12489,7 @@
         <w:pStyle w:val="Heading1"/>
         <w:spacing w:before="0" w:after="240"/>
       </w:pPr>
-      <w:bookmarkStart w:id="26" w:name="_Toc225879178"/>
+      <w:bookmarkStart w:id="26" w:name="_Toc225985175"/>
       <w:r>
         <w:rPr>
           <w:rFonts w:ascii="Times New Roman" w:hAnsi="Times New Roman" w:cs="Times New Roman"/>
@@ -12510,7 +12504,7 @@
         <w:pStyle w:val="Heading2"/>
         <w:spacing w:before="0" w:after="200"/>
       </w:pPr>
-      <w:bookmarkStart w:id="27" w:name="_Toc225879179"/>
+      <w:bookmarkStart w:id="27" w:name="_Toc225985176"/>
       <w:r>
         <w:rPr>
           <w:rFonts w:ascii="Times New Roman" w:hAnsi="Times New Roman" w:cs="Times New Roman"/>
@@ -12559,7 +12553,7 @@
         <w:pStyle w:val="Heading2"/>
         <w:spacing w:before="0" w:after="200"/>
       </w:pPr>
-      <w:bookmarkStart w:id="28" w:name="_Toc225879180"/>
+      <w:bookmarkStart w:id="28" w:name="_Toc225985177"/>
       <w:r>
         <w:rPr>
           <w:rFonts w:ascii="Times New Roman" w:hAnsi="Times New Roman" w:cs="Times New Roman"/>
@@ -12661,7 +12655,7 @@
         <w:pStyle w:val="Heading2"/>
         <w:spacing w:before="0" w:after="200"/>
       </w:pPr>
-      <w:bookmarkStart w:id="29" w:name="_Toc225879181"/>
+      <w:bookmarkStart w:id="29" w:name="_Toc225985178"/>
       <w:r>
         <w:rPr>
           <w:rFonts w:ascii="Times New Roman" w:hAnsi="Times New Roman" w:cs="Times New Roman"/>
@@ -12727,7 +12721,7 @@
         <w:pStyle w:val="Heading2"/>
         <w:spacing w:before="0" w:after="200"/>
       </w:pPr>
-      <w:bookmarkStart w:id="30" w:name="_Toc225879182"/>
+      <w:bookmarkStart w:id="30" w:name="_Toc225985179"/>
       <w:r>
         <w:rPr>
           <w:rFonts w:ascii="Times New Roman" w:hAnsi="Times New Roman" w:cs="Times New Roman"/>
@@ -12771,7 +12765,7 @@
         <w:pStyle w:val="Heading2"/>
         <w:spacing w:before="0" w:after="200"/>
       </w:pPr>
-      <w:bookmarkStart w:id="31" w:name="_Toc225879183"/>
+      <w:bookmarkStart w:id="31" w:name="_Toc225985180"/>
       <w:r>
         <w:rPr>
           <w:rFonts w:ascii="Times New Roman" w:hAnsi="Times New Roman" w:cs="Times New Roman"/>
@@ -12887,7 +12881,7 @@
         <w:pStyle w:val="Heading2"/>
         <w:spacing w:before="0" w:after="200"/>
       </w:pPr>
-      <w:bookmarkStart w:id="32" w:name="_Toc225879184"/>
+      <w:bookmarkStart w:id="32" w:name="_Toc225985181"/>
       <w:r>
         <w:rPr>
           <w:rFonts w:ascii="Times New Roman" w:hAnsi="Times New Roman" w:cs="Times New Roman"/>
@@ -12931,7 +12925,7 @@
         <w:pStyle w:val="Heading1"/>
         <w:spacing w:before="0" w:after="240"/>
       </w:pPr>
-      <w:bookmarkStart w:id="33" w:name="_Toc225879185"/>
+      <w:bookmarkStart w:id="33" w:name="_Toc225985182"/>
       <w:r>
         <w:rPr>
           <w:rFonts w:ascii="Times New Roman" w:hAnsi="Times New Roman" w:cs="Times New Roman"/>
@@ -13026,7 +13020,7 @@
         <w:pStyle w:val="Heading1"/>
         <w:spacing w:before="0" w:after="240"/>
       </w:pPr>
-      <w:bookmarkStart w:id="34" w:name="_Toc225879186"/>
+      <w:bookmarkStart w:id="34" w:name="_Toc225985183"/>
       <w:r>
         <w:rPr>
           <w:rFonts w:ascii="Times New Roman" w:hAnsi="Times New Roman" w:cs="Times New Roman"/>
@@ -13099,7 +13093,7 @@
       <w:pPr>
         <w:pStyle w:val="Heading1"/>
       </w:pPr>
-      <w:bookmarkStart w:id="35" w:name="_Toc225879187"/>
+      <w:bookmarkStart w:id="35" w:name="_Toc225985184"/>
       <w:r>
         <w:rPr>
           <w:rFonts w:ascii="Times New Roman" w:hAnsi="Times New Roman"/>
@@ -13533,7 +13527,7 @@
         <w:pStyle w:val="Heading1"/>
         <w:jc w:val="left"/>
       </w:pPr>
-      <w:bookmarkStart w:id="36" w:name="_Toc225879188"/>
+      <w:bookmarkStart w:id="36" w:name="_Toc225985185"/>
       <w:r>
         <w:lastRenderedPageBreak/>
         <w:t>ANNEXES</w:t>
@@ -18409,10 +18403,10 @@
           <w:noProof/>
         </w:rPr>
         <w:drawing>
-          <wp:inline distT="0" distB="0" distL="0" distR="0" wp14:anchorId="7E1B8946" wp14:editId="016E4782">
+          <wp:inline distT="0" distB="0" distL="0" distR="0" wp14:anchorId="5EC44409" wp14:editId="2A72F340">
             <wp:extent cx="5669280" cy="4009568"/>
             <wp:effectExtent l="0" t="0" r="0" b="0"/>
-            <wp:docPr id="1389222017" name="Picture 1389222017"/>
+            <wp:docPr id="1465515890" name="Picture 1465515890"/>
             <wp:cNvGraphicFramePr>
               <a:graphicFrameLocks xmlns:a="http://schemas.openxmlformats.org/drawingml/2006/main" noChangeAspect="1"/>
             </wp:cNvGraphicFramePr>
@@ -18672,31 +18666,31 @@
       </w:rPr>
     </w:lvl>
   </w:abstractNum>
-  <w:num w:numId="1" w16cid:durableId="920338463">
+  <w:num w:numId="1" w16cid:durableId="1132746357">
     <w:abstractNumId w:val="8"/>
   </w:num>
-  <w:num w:numId="2" w16cid:durableId="1636179320">
+  <w:num w:numId="2" w16cid:durableId="986670870">
     <w:abstractNumId w:val="6"/>
   </w:num>
-  <w:num w:numId="3" w16cid:durableId="522793443">
+  <w:num w:numId="3" w16cid:durableId="2033846359">
     <w:abstractNumId w:val="5"/>
   </w:num>
-  <w:num w:numId="4" w16cid:durableId="1297641871">
+  <w:num w:numId="4" w16cid:durableId="355353142">
     <w:abstractNumId w:val="4"/>
   </w:num>
-  <w:num w:numId="5" w16cid:durableId="1019627356">
+  <w:num w:numId="5" w16cid:durableId="2028361708">
     <w:abstractNumId w:val="7"/>
   </w:num>
-  <w:num w:numId="6" w16cid:durableId="1872567896">
+  <w:num w:numId="6" w16cid:durableId="1905337298">
     <w:abstractNumId w:val="3"/>
   </w:num>
-  <w:num w:numId="7" w16cid:durableId="783115814">
+  <w:num w:numId="7" w16cid:durableId="2099905833">
     <w:abstractNumId w:val="2"/>
   </w:num>
-  <w:num w:numId="8" w16cid:durableId="1979339043">
+  <w:num w:numId="8" w16cid:durableId="610163241">
     <w:abstractNumId w:val="1"/>
   </w:num>
-  <w:num w:numId="9" w16cid:durableId="1431313509">
+  <w:num w:numId="9" w16cid:durableId="654651963">
     <w:abstractNumId w:val="0"/>
   </w:num>
 </w:numbering>
@@ -30093,7 +30087,7 @@
     <w:autoRedefine/>
     <w:uiPriority w:val="39"/>
     <w:unhideWhenUsed/>
-    <w:rsid w:val="005D2043"/>
+    <w:rsid w:val="00425B4E"/>
     <w:pPr>
       <w:spacing w:after="100"/>
     </w:pPr>
@@ -30105,7 +30099,7 @@
     <w:autoRedefine/>
     <w:uiPriority w:val="39"/>
     <w:unhideWhenUsed/>
-    <w:rsid w:val="005D2043"/>
+    <w:rsid w:val="00425B4E"/>
     <w:pPr>
       <w:spacing w:after="100"/>
       <w:ind w:left="240"/>
@@ -30116,7 +30110,7 @@
     <w:basedOn w:val="DefaultParagraphFont"/>
     <w:uiPriority w:val="99"/>
     <w:unhideWhenUsed/>
-    <w:rsid w:val="005D2043"/>
+    <w:rsid w:val="00425B4E"/>
     <w:rPr>
       <w:color w:val="0000FF" w:themeColor="hyperlink"/>
       <w:u w:val="single"/>

</xml_diff>